<commit_message>
Konversi .docx: A2-FusionRS (humanized final) + A2-IRM conference 6-pages (humanized)
A2-FusionRS.docx diregenerasi dari A2-FusionRS_manuscript_humanized.md
(versi final tervalidasi + 4 perbaikan bedah): 10 tabel Word, 99 equation
OMML editable.

A2-IRM_manuscript_conference_6pages.docx (baru) dari
A2-IRM_manuscript_conference_6pages_humanized.md (tervalidasi bersih, nol
temuan perlu perbaikan): 3 tabel Word, 37 equation OMML, 1 gambar tertanam
(Fig. 1 RMSE main result; --resource-path dipakai agar path relatif
figures/ ternavigasi benar).

Co-Authored-By: Claude Opus 4.8 <noreply@anthropic.com>
</commit_message>
<xml_diff>
--- a/manuscript/A2-FusionRS.docx
+++ b/manuscript/A2-FusionRS.docx
@@ -107,79 +107,85 @@
         <w:t xml:space="preserve"> </w:t>
       </w:r>
       <w:r>
-        <w:t xml:space="preserve">opinions users express in text, and aspect-based sentiment analysis (ABSA) makes those</w:t>
-      </w:r>
-      <w:r>
-        <w:t xml:space="preserve"> </w:t>
-      </w:r>
-      <w:r>
-        <w:t xml:space="preserve">opinions fine-grained. Two questions are usually left open: how to incorporate</w:t>
-      </w:r>
-      <w:r>
-        <w:t xml:space="preserve"> </w:t>
-      </w:r>
-      <w:r>
-        <w:t xml:space="preserve">open-vocabulary, model-based aspect sentiment — whose per-review aspect set is</w:t>
-      </w:r>
-      <w:r>
-        <w:t xml:space="preserve"> </w:t>
-      </w:r>
-      <w:r>
-        <w:t xml:space="preserve">variable-length — and, when an aspect signal improves a recommender, whether the gain</w:t>
-      </w:r>
-      <w:r>
-        <w:t xml:space="preserve"> </w:t>
-      </w:r>
-      <w:r>
-        <w:t xml:space="preserve">comes from the signal or from the fusion architecture that consumes it. We present</w:t>
-      </w:r>
-      <w:r>
-        <w:t xml:space="preserve"> </w:t>
-      </w:r>
-      <w:r>
-        <w:t xml:space="preserve">A2-FusionRS, an attention-gated fusion recommender that extends a static-fusion hybrid</w:t>
-      </w:r>
-      <w:r>
-        <w:t xml:space="preserve"> </w:t>
-      </w:r>
-      <w:r>
-        <w:t xml:space="preserve">(A2-IRM) with model-based per-aspect sentiment, summarized by a learned aspect-sequence</w:t>
-      </w:r>
-      <w:r>
-        <w:t xml:space="preserve"> </w:t>
-      </w:r>
-      <w:r>
-        <w:t xml:space="preserve">pooling layer that preserves aspect identity, and combined with collaborative and</w:t>
-      </w:r>
-      <w:r>
-        <w:t xml:space="preserve"> </w:t>
-      </w:r>
-      <w:r>
-        <w:t xml:space="preserve">content streams through cross-attention and gated pooling over a residual base. Across</w:t>
-      </w:r>
-      <w:r>
-        <w:t xml:space="preserve"> </w:t>
-      </w:r>
-      <w:r>
-        <w:t xml:space="preserve">three domains (Amazon Electronics, Yelp Restaurant, TripAdvisor Hotel) and five seeds,</w:t>
-      </w:r>
-      <w:r>
-        <w:t xml:space="preserve"> </w:t>
-      </w:r>
-      <w:r>
-        <w:t xml:space="preserve">A2-FusionRS attains the lowest RMSE in every domain (0.6418, 0.6665, 0.6196), improving</w:t>
-      </w:r>
-      <w:r>
-        <w:t xml:space="preserve"> </w:t>
-      </w:r>
-      <w:r>
-        <w:t xml:space="preserve">significantly over A2-IRM (1.5–1.9%) and over classical and neural collaborative</w:t>
-      </w:r>
-      <w:r>
-        <w:t xml:space="preserve"> </w:t>
-      </w:r>
-      <w:r>
-        <w:t xml:space="preserve">baselines (26–44% over NeuMF), with all gains significant at every seed (Wilcoxon,</w:t>
+        <w:t xml:space="preserve">opinions users express in text. Aspect-based sentiment analysis (ABSA) makes those</w:t>
+      </w:r>
+      <w:r>
+        <w:t xml:space="preserve"> </w:t>
+      </w:r>
+      <w:r>
+        <w:t xml:space="preserve">opinions fine-grained. Two questions, however, are usually left open. The first concerns</w:t>
+      </w:r>
+      <w:r>
+        <w:t xml:space="preserve"> </w:t>
+      </w:r>
+      <w:r>
+        <w:t xml:space="preserve">how to incorporate open-vocabulary, model-based aspect sentiment, whose per-review aspect</w:t>
+      </w:r>
+      <w:r>
+        <w:t xml:space="preserve"> </w:t>
+      </w:r>
+      <w:r>
+        <w:t xml:space="preserve">set is variable in length. The second concerns attribution: when an aspect signal</w:t>
+      </w:r>
+      <w:r>
+        <w:t xml:space="preserve"> </w:t>
+      </w:r>
+      <w:r>
+        <w:t xml:space="preserve">improves a recommender, is the gain due to the signal itself or to the fusion architecture</w:t>
+      </w:r>
+      <w:r>
+        <w:t xml:space="preserve"> </w:t>
+      </w:r>
+      <w:r>
+        <w:t xml:space="preserve">that consumes it? We present A2-FusionRS, an attention-gated fusion recommender that</w:t>
+      </w:r>
+      <w:r>
+        <w:t xml:space="preserve"> </w:t>
+      </w:r>
+      <w:r>
+        <w:t xml:space="preserve">extends a static-fusion hybrid (A2-IRM) with model-based per-aspect sentiment. The added</w:t>
+      </w:r>
+      <w:r>
+        <w:t xml:space="preserve"> </w:t>
+      </w:r>
+      <w:r>
+        <w:t xml:space="preserve">signal is summarized by a learned aspect-sequence pooling layer that preserves aspect</w:t>
+      </w:r>
+      <w:r>
+        <w:t xml:space="preserve"> </w:t>
+      </w:r>
+      <w:r>
+        <w:t xml:space="preserve">identity, and it is combined with collaborative and content streams through cross-attention</w:t>
+      </w:r>
+      <w:r>
+        <w:t xml:space="preserve"> </w:t>
+      </w:r>
+      <w:r>
+        <w:t xml:space="preserve">and gated pooling over a residual base. Across three domains (Amazon Electronics, Yelp</w:t>
+      </w:r>
+      <w:r>
+        <w:t xml:space="preserve"> </w:t>
+      </w:r>
+      <w:r>
+        <w:t xml:space="preserve">Restaurant, TripAdvisor Hotel) and five seeds, A2-FusionRS attains the lowest RMSE in</w:t>
+      </w:r>
+      <w:r>
+        <w:t xml:space="preserve"> </w:t>
+      </w:r>
+      <w:r>
+        <w:t xml:space="preserve">every domain (0.6418, 0.6665, 0.6196). This improves significantly over A2-IRM (1.5–1.9%)</w:t>
+      </w:r>
+      <w:r>
+        <w:t xml:space="preserve"> </w:t>
+      </w:r>
+      <w:r>
+        <w:t xml:space="preserve">and over classical and neural collaborative baselines (26–44% over NeuMF), with all gains</w:t>
+      </w:r>
+      <w:r>
+        <w:t xml:space="preserve"> </w:t>
+      </w:r>
+      <w:r>
+        <w:t xml:space="preserve">significant at every seed (Wilcoxon,</w:t>
       </w:r>
       <w:r>
         <w:t xml:space="preserve"> </w:t>
@@ -199,55 +205,55 @@
         </m:r>
       </m:oMath>
       <w:r>
-        <w:t xml:space="preserve">). A component-level attribution — including a control that fuses the same</w:t>
-      </w:r>
-      <w:r>
-        <w:t xml:space="preserve"> </w:t>
-      </w:r>
-      <w:r>
-        <w:t xml:space="preserve">model-based aspect features with a static tree — shows the improvement is due to the</w:t>
-      </w:r>
-      <w:r>
-        <w:t xml:space="preserve"> </w:t>
-      </w:r>
-      <w:r>
-        <w:t xml:space="preserve">aspect modality rather than the attention mechanism, which matches, but does not beat,</w:t>
-      </w:r>
-      <w:r>
-        <w:t xml:space="preserve"> </w:t>
-      </w:r>
-      <w:r>
-        <w:t xml:space="preserve">the static fusion on accuracy; we report this deliberately falsifiable result rather than</w:t>
-      </w:r>
-      <w:r>
-        <w:t xml:space="preserve"> </w:t>
-      </w:r>
-      <w:r>
-        <w:t xml:space="preserve">overclaim the architecture. We further find that the benefit of model-based ABSA grows as</w:t>
-      </w:r>
-      <w:r>
-        <w:t xml:space="preserve"> </w:t>
-      </w:r>
-      <w:r>
-        <w:t xml:space="preserve">a domain’s keyword-aspect coverage falls, and that the model’s aspect attention is</w:t>
-      </w:r>
-      <w:r>
-        <w:t xml:space="preserve"> </w:t>
-      </w:r>
-      <w:r>
-        <w:t xml:space="preserve">faithful under a perturbation test (the most-attended aspect drives the prediction in</w:t>
-      </w:r>
-      <w:r>
-        <w:t xml:space="preserve"> </w:t>
-      </w:r>
-      <w:r>
-        <w:t xml:space="preserve">~70% of reviews). The result is a recommender that improves over strong baselines together</w:t>
-      </w:r>
-      <w:r>
-        <w:t xml:space="preserve"> </w:t>
-      </w:r>
-      <w:r>
-        <w:t xml:space="preserve">with an evidenced account of why.</w:t>
+        <w:t xml:space="preserve">). A component-level attribution, including a</w:t>
+      </w:r>
+      <w:r>
+        <w:t xml:space="preserve"> </w:t>
+      </w:r>
+      <w:r>
+        <w:t xml:space="preserve">control that fuses the same model-based aspect features with a static tree, shows that the</w:t>
+      </w:r>
+      <w:r>
+        <w:t xml:space="preserve"> </w:t>
+      </w:r>
+      <w:r>
+        <w:t xml:space="preserve">improvement is due to the aspect modality rather than the attention mechanism. The</w:t>
+      </w:r>
+      <w:r>
+        <w:t xml:space="preserve"> </w:t>
+      </w:r>
+      <w:r>
+        <w:t xml:space="preserve">attention mechanism matches, but does not beat, the static fusion on accuracy, and we</w:t>
+      </w:r>
+      <w:r>
+        <w:t xml:space="preserve"> </w:t>
+      </w:r>
+      <w:r>
+        <w:t xml:space="preserve">report this deliberately falsifiable result rather than overclaim the architecture. We</w:t>
+      </w:r>
+      <w:r>
+        <w:t xml:space="preserve"> </w:t>
+      </w:r>
+      <w:r>
+        <w:t xml:space="preserve">further find that the benefit of model-based ABSA grows as a domain’s keyword-aspect</w:t>
+      </w:r>
+      <w:r>
+        <w:t xml:space="preserve"> </w:t>
+      </w:r>
+      <w:r>
+        <w:t xml:space="preserve">coverage falls. The model’s aspect attention is also faithful under a perturbation test:</w:t>
+      </w:r>
+      <w:r>
+        <w:t xml:space="preserve"> </w:t>
+      </w:r>
+      <w:r>
+        <w:t xml:space="preserve">the most-attended aspect drives the prediction in ~70% of reviews. The result is a</w:t>
+      </w:r>
+      <w:r>
+        <w:t xml:space="preserve"> </w:t>
+      </w:r>
+      <w:r>
+        <w:t xml:space="preserve">recommender that improves over strong baselines together with an evidenced account of why.</w:t>
       </w:r>
     </w:p>
     <w:p>
@@ -302,37 +308,43 @@
         <w:t xml:space="preserve"> </w:t>
       </w:r>
       <w:r>
-        <w:t xml:space="preserve">ratings they collect are the classical signal for learning user preferences. That signal,</w:t>
-      </w:r>
-      <w:r>
-        <w:t xml:space="preserve"> </w:t>
-      </w:r>
-      <w:r>
-        <w:t xml:space="preserve">however, is chronically thin: the user–item interaction matrix is extremely sparse, and</w:t>
-      </w:r>
-      <w:r>
-        <w:t xml:space="preserve"> </w:t>
-      </w:r>
-      <w:r>
-        <w:t xml:space="preserve">newly arrived users and items carry little or no history, so purely rating-based</w:t>
-      </w:r>
-      <w:r>
-        <w:t xml:space="preserve"> </w:t>
-      </w:r>
-      <w:r>
-        <w:t xml:space="preserve">collaborative filtering degrades badly under the sparsity and cold-start conditions that</w:t>
-      </w:r>
-      <w:r>
-        <w:t xml:space="preserve"> </w:t>
-      </w:r>
-      <w:r>
-        <w:t xml:space="preserve">dominate real catalogs (Idrissi &amp; Zellou, 2020; Yuan &amp; Hernandez, 2023). A large body of</w:t>
-      </w:r>
-      <w:r>
-        <w:t xml:space="preserve"> </w:t>
-      </w:r>
-      <w:r>
-        <w:t xml:space="preserve">work therefore turns to the free-text reviews that accompany ratings, which describe</w:t>
+        <w:t xml:space="preserve">ratings they collect remain the classical signal for learning user preferences. That</w:t>
+      </w:r>
+      <w:r>
+        <w:t xml:space="preserve"> </w:t>
+      </w:r>
+      <w:r>
+        <w:t xml:space="preserve">signal is chronically thin. The user–item interaction matrix is extremely sparse, and</w:t>
+      </w:r>
+      <w:r>
+        <w:t xml:space="preserve"> </w:t>
+      </w:r>
+      <w:r>
+        <w:t xml:space="preserve">newly arrived users and items carry little or no history. Purely rating-based</w:t>
+      </w:r>
+      <w:r>
+        <w:t xml:space="preserve"> </w:t>
+      </w:r>
+      <w:r>
+        <w:t xml:space="preserve">collaborative filtering therefore degrades badly under the sparsity and cold-start</w:t>
+      </w:r>
+      <w:r>
+        <w:t xml:space="preserve"> </w:t>
+      </w:r>
+      <w:r>
+        <w:t xml:space="preserve">conditions that dominate real catalogs (Idrissi &amp; Zellou, 2020; Yuan &amp; Hernandez, 2023).</w:t>
+      </w:r>
+      <w:r>
+        <w:t xml:space="preserve"> </w:t>
+      </w:r>
+      <w:r>
+        <w:t xml:space="preserve">A large body of work turns instead to the free-text reviews that accompany ratings. These</w:t>
+      </w:r>
+      <w:r>
+        <w:t xml:space="preserve"> </w:t>
+      </w:r>
+      <w:r>
+        <w:t xml:space="preserve">reviews describe</w:t>
       </w:r>
       <w:r>
         <w:t xml:space="preserve"> </w:t>
@@ -348,13 +360,13 @@
         <w:t xml:space="preserve"> </w:t>
       </w:r>
       <w:r>
-        <w:t xml:space="preserve">a user liked an item and expose preferences a single star rating cannot (Duan et al.,</w:t>
-      </w:r>
-      <w:r>
-        <w:t xml:space="preserve"> </w:t>
-      </w:r>
-      <w:r>
-        <w:t xml:space="preserve">2022; Elahi et al., 2023).</w:t>
+        <w:t xml:space="preserve">a user liked an item, exposing preferences that a single star</w:t>
+      </w:r>
+      <w:r>
+        <w:t xml:space="preserve"> </w:t>
+      </w:r>
+      <w:r>
+        <w:t xml:space="preserve">rating cannot (Duan et al., 2022; Elahi et al., 2023).</w:t>
       </w:r>
     </w:p>
     <w:p>
@@ -362,13 +374,13 @@
         <w:pStyle w:val="BodyText"/>
       </w:pPr>
       <w:r>
-        <w:t xml:space="preserve">Among review signals, aspect-based sentiment analysis (ABSA) is especially attractive</w:t>
-      </w:r>
-      <w:r>
-        <w:t xml:space="preserve"> </w:t>
-      </w:r>
-      <w:r>
-        <w:t xml:space="preserve">because it decomposes an opinion into sentiments toward specific aspects — a restaurant’s</w:t>
+        <w:t xml:space="preserve">Among review signals, aspect-based sentiment analysis (ABSA) is especially attractive.</w:t>
+      </w:r>
+      <w:r>
+        <w:t xml:space="preserve"> </w:t>
+      </w:r>
+      <w:r>
+        <w:t xml:space="preserve">It decomposes an opinion into sentiments toward specific aspects, such as a restaurant’s</w:t>
       </w:r>
       <w:r>
         <w:t xml:space="preserve"> </w:t>
@@ -397,7 +409,7 @@
         <w:t xml:space="preserve">ambiance</w:t>
       </w:r>
       <w:r>
-        <w:t xml:space="preserve">, a product’s</w:t>
+        <w:t xml:space="preserve">, or a product’s</w:t>
       </w:r>
       <w:r>
         <w:t xml:space="preserve"> </w:t>
@@ -426,10 +438,7 @@
         <w:t xml:space="preserve">screen</w:t>
       </w:r>
       <w:r>
-        <w:t xml:space="preserve"> </w:t>
-      </w:r>
-      <w:r>
-        <w:t xml:space="preserve">— rather than collapsing a</w:t>
+        <w:t xml:space="preserve">, rather than collapsing a</w:t>
       </w:r>
       <w:r>
         <w:t xml:space="preserve"> </w:t>
@@ -453,19 +462,19 @@
         <w:t xml:space="preserve"> </w:t>
       </w:r>
       <w:r>
-        <w:t xml:space="preserve">where ratings are least reliable: reviewers frequently assign a high star rating while</w:t>
-      </w:r>
-      <w:r>
-        <w:t xml:space="preserve"> </w:t>
-      </w:r>
-      <w:r>
-        <w:t xml:space="preserve">voicing aspect-level dissatisfaction, an inconsistency that aspect sentiment can surface</w:t>
-      </w:r>
-      <w:r>
-        <w:t xml:space="preserve"> </w:t>
-      </w:r>
-      <w:r>
-        <w:t xml:space="preserve">and correct (Aramanda et al., 2023; Rabiu et al., 2022).</w:t>
+        <w:t xml:space="preserve">where ratings are least reliable. Reviewers frequently assign a high star rating while</w:t>
+      </w:r>
+      <w:r>
+        <w:t xml:space="preserve"> </w:t>
+      </w:r>
+      <w:r>
+        <w:t xml:space="preserve">voicing aspect-level dissatisfaction, and aspect sentiment can surface and correct exactly</w:t>
+      </w:r>
+      <w:r>
+        <w:t xml:space="preserve"> </w:t>
+      </w:r>
+      <w:r>
+        <w:t xml:space="preserve">this kind of inconsistency (Aramanda et al., 2023; Rabiu et al., 2022).</w:t>
       </w:r>
     </w:p>
     <w:p>
@@ -473,26 +482,13 @@
         <w:pStyle w:val="BodyText"/>
       </w:pPr>
       <w:r>
-        <w:t xml:space="preserve">Despite this progress, two gaps motivate the present work.</w:t>
-      </w:r>
-      <w:r>
-        <w:t xml:space="preserve"> </w:t>
-      </w:r>
-      <w:r>
-        <w:rPr>
-          <w:b/>
-          <w:bCs/>
-        </w:rPr>
-        <w:t xml:space="preserve">First</w:t>
-      </w:r>
-      <w:r>
-        <w:t xml:space="preserve">, the aspect signal</w:t>
-      </w:r>
-      <w:r>
-        <w:t xml:space="preserve"> </w:t>
-      </w:r>
-      <w:r>
-        <w:t xml:space="preserve">itself is usually extracted with a</w:t>
+        <w:t xml:space="preserve">Despite this progress, two gaps motivate the present work. The first concerns the aspect</w:t>
+      </w:r>
+      <w:r>
+        <w:t xml:space="preserve"> </w:t>
+      </w:r>
+      <w:r>
+        <w:t xml:space="preserve">signal itself. It is usually extracted with a</w:t>
       </w:r>
       <w:r>
         <w:t xml:space="preserve"> </w:t>
@@ -505,28 +501,25 @@
         <w:t xml:space="preserve">fixed taxonomy</w:t>
       </w:r>
       <w:r>
-        <w:t xml:space="preserve"> </w:t>
-      </w:r>
-      <w:r>
-        <w:t xml:space="preserve">— a handful of predefined categories</w:t>
-      </w:r>
-      <w:r>
-        <w:t xml:space="preserve"> </w:t>
-      </w:r>
-      <w:r>
-        <w:t xml:space="preserve">matched by keywords — whose coverage varies sharply across domains and collapses when an</w:t>
-      </w:r>
-      <w:r>
-        <w:t xml:space="preserve"> </w:t>
-      </w:r>
-      <w:r>
-        <w:t xml:space="preserve">aspect vocabulary is open-ended. Open-vocabulary, model-based ABSA can extract aspects a</w:t>
-      </w:r>
-      <w:r>
-        <w:t xml:space="preserve"> </w:t>
-      </w:r>
-      <w:r>
-        <w:t xml:space="preserve">fixed taxonomy never anticipates, but it produces a</w:t>
+        <w:t xml:space="preserve">, a handful of predefined</w:t>
+      </w:r>
+      <w:r>
+        <w:t xml:space="preserve"> </w:t>
+      </w:r>
+      <w:r>
+        <w:t xml:space="preserve">categories matched by keywords, whose coverage varies sharply across domains and collapses</w:t>
+      </w:r>
+      <w:r>
+        <w:t xml:space="preserve"> </w:t>
+      </w:r>
+      <w:r>
+        <w:t xml:space="preserve">when an aspect vocabulary is open-ended. Open-vocabulary, model-based ABSA can extract</w:t>
+      </w:r>
+      <w:r>
+        <w:t xml:space="preserve"> </w:t>
+      </w:r>
+      <w:r>
+        <w:t xml:space="preserve">aspects that a fixed taxonomy never anticipates. It produces, however, a</w:t>
       </w:r>
       <w:r>
         <w:t xml:space="preserve"> </w:t>
@@ -536,44 +529,39 @@
           <w:i/>
           <w:iCs/>
         </w:rPr>
-        <w:t xml:space="preserve">variable-length, per-review set</w:t>
-      </w:r>
-      <w:r>
-        <w:t xml:space="preserve"> </w:t>
-      </w:r>
-      <w:r>
-        <w:t xml:space="preserve">of</w:t>
-      </w:r>
-      <w:r>
-        <w:t xml:space="preserve"> </w:t>
-      </w:r>
-      <w:r>
-        <w:t xml:space="preserve">aspects that is awkward to fuse with the fixed-width features recommenders expect, and it</w:t>
-      </w:r>
-      <w:r>
-        <w:t xml:space="preserve"> </w:t>
-      </w:r>
-      <w:r>
-        <w:t xml:space="preserve">is unclear when its additional cost is repaid.</w:t>
-      </w:r>
-      <w:r>
-        <w:t xml:space="preserve"> </w:t>
+        <w:t xml:space="preserve">variable-length,</w:t>
       </w:r>
       <w:r>
         <w:rPr>
-          <w:b/>
-          <w:bCs/>
+          <w:i/>
+          <w:iCs/>
         </w:rPr>
-        <w:t xml:space="preserve">Second</w:t>
-      </w:r>
-      <w:r>
-        <w:t xml:space="preserve">, and more consequential for the</w:t>
-      </w:r>
-      <w:r>
-        <w:t xml:space="preserve"> </w:t>
-      </w:r>
-      <w:r>
-        <w:t xml:space="preserve">field, when an aspect signal</w:t>
+        <w:t xml:space="preserve"> </w:t>
+      </w:r>
+      <w:r>
+        <w:rPr>
+          <w:i/>
+          <w:iCs/>
+        </w:rPr>
+        <w:t xml:space="preserve">per-review set</w:t>
+      </w:r>
+      <w:r>
+        <w:t xml:space="preserve"> </w:t>
+      </w:r>
+      <w:r>
+        <w:t xml:space="preserve">of aspects that is awkward to fuse with the fixed-width features</w:t>
+      </w:r>
+      <w:r>
+        <w:t xml:space="preserve"> </w:t>
+      </w:r>
+      <w:r>
+        <w:t xml:space="preserve">recommenders expect, and it remains unclear when its additional cost is repaid. The second</w:t>
+      </w:r>
+      <w:r>
+        <w:t xml:space="preserve"> </w:t>
+      </w:r>
+      <w:r>
+        <w:t xml:space="preserve">gap is more consequential for the field. When an aspect signal</w:t>
       </w:r>
       <w:r>
         <w:t xml:space="preserve"> </w:t>
@@ -589,43 +577,43 @@
         <w:t xml:space="preserve"> </w:t>
       </w:r>
       <w:r>
-        <w:t xml:space="preserve">improve a recommender, the improvement is seldom</w:t>
-      </w:r>
-      <w:r>
-        <w:t xml:space="preserve"> </w:t>
-      </w:r>
-      <w:r>
-        <w:t xml:space="preserve">attributed: papers typically introduce a new architecture together with a new signal and</w:t>
-      </w:r>
-      <w:r>
-        <w:t xml:space="preserve"> </w:t>
-      </w:r>
-      <w:r>
-        <w:t xml:space="preserve">report a net gain, leaving open whether the architecture or the signal did the work. A</w:t>
-      </w:r>
-      <w:r>
-        <w:t xml:space="preserve"> </w:t>
-      </w:r>
-      <w:r>
-        <w:t xml:space="preserve">recommender that is credited to its attention mechanism, but would perform identically</w:t>
-      </w:r>
-      <w:r>
-        <w:t xml:space="preserve"> </w:t>
-      </w:r>
-      <w:r>
-        <w:t xml:space="preserve">with a simple fuser given the same features, has been mis-attributed — and the field’s</w:t>
-      </w:r>
-      <w:r>
-        <w:t xml:space="preserve"> </w:t>
-      </w:r>
-      <w:r>
-        <w:t xml:space="preserve">running assumption that more elaborate fusion is the source of gains goes largely</w:t>
-      </w:r>
-      <w:r>
-        <w:t xml:space="preserve"> </w:t>
-      </w:r>
-      <w:r>
-        <w:t xml:space="preserve">untested.</w:t>
+        <w:t xml:space="preserve">improve a</w:t>
+      </w:r>
+      <w:r>
+        <w:t xml:space="preserve"> </w:t>
+      </w:r>
+      <w:r>
+        <w:t xml:space="preserve">recommender, the improvement is seldom attributed. Papers typically introduce a new</w:t>
+      </w:r>
+      <w:r>
+        <w:t xml:space="preserve"> </w:t>
+      </w:r>
+      <w:r>
+        <w:t xml:space="preserve">architecture together with a new signal and report a net gain, leaving open whether the</w:t>
+      </w:r>
+      <w:r>
+        <w:t xml:space="preserve"> </w:t>
+      </w:r>
+      <w:r>
+        <w:t xml:space="preserve">architecture or the signal did the work. A recommender that is credited to its attention</w:t>
+      </w:r>
+      <w:r>
+        <w:t xml:space="preserve"> </w:t>
+      </w:r>
+      <w:r>
+        <w:t xml:space="preserve">mechanism, but that would perform identically with a simple fuser given the same features,</w:t>
+      </w:r>
+      <w:r>
+        <w:t xml:space="preserve"> </w:t>
+      </w:r>
+      <w:r>
+        <w:t xml:space="preserve">has effectively been mis-attributed. The field’s running assumption that more elaborate</w:t>
+      </w:r>
+      <w:r>
+        <w:t xml:space="preserve"> </w:t>
+      </w:r>
+      <w:r>
+        <w:t xml:space="preserve">fusion is the source of gains goes largely untested.</w:t>
       </w:r>
     </w:p>
     <w:p>
@@ -633,7 +621,7 @@
         <w:pStyle w:val="BodyText"/>
       </w:pPr>
       <w:r>
-        <w:t xml:space="preserve">This paper studies both gaps in one system. We build on A2-IRM, our own prior</w:t>
+        <w:t xml:space="preserve">This paper addresses both gaps within a single system. We build on A2-IRM, our own prior</w:t>
       </w:r>
       <w:r>
         <w:t xml:space="preserve"> </w:t>
@@ -664,19 +652,22 @@
         <w:t xml:space="preserve">A2-FusionRS</w:t>
       </w:r>
       <w:r>
-        <w:t xml:space="preserve">, which (i) adds open-vocabulary</w:t>
-      </w:r>
-      <w:r>
-        <w:t xml:space="preserve"> </w:t>
-      </w:r>
-      <w:r>
-        <w:t xml:space="preserve">model-based ABSA (PyABSA; Yang &amp; Li, 2023) as a complementary modality, summarized by a</w:t>
-      </w:r>
-      <w:r>
-        <w:t xml:space="preserve"> </w:t>
-      </w:r>
-      <w:r>
-        <w:t xml:space="preserve">learned</w:t>
+        <w:t xml:space="preserve"> </w:t>
+      </w:r>
+      <w:r>
+        <w:t xml:space="preserve">in two</w:t>
+      </w:r>
+      <w:r>
+        <w:t xml:space="preserve"> </w:t>
+      </w:r>
+      <w:r>
+        <w:t xml:space="preserve">ways. First, it adds open-vocabulary model-based ABSA (PyABSA; Yang &amp; Li, 2023) as a</w:t>
+      </w:r>
+      <w:r>
+        <w:t xml:space="preserve"> </w:t>
+      </w:r>
+      <w:r>
+        <w:t xml:space="preserve">complementary modality, summarized by a learned</w:t>
       </w:r>
       <w:r>
         <w:t xml:space="preserve"> </w:t>
@@ -692,19 +683,25 @@
         <w:t xml:space="preserve"> </w:t>
       </w:r>
       <w:r>
-        <w:t xml:space="preserve">layer that preserves aspect identity instead of</w:t>
-      </w:r>
-      <w:r>
-        <w:t xml:space="preserve"> </w:t>
-      </w:r>
-      <w:r>
-        <w:t xml:space="preserve">averaging it away, and (ii) fuses the modalities with an attention-gated mechanism whose</w:t>
-      </w:r>
-      <w:r>
-        <w:t xml:space="preserve"> </w:t>
-      </w:r>
-      <w:r>
-        <w:t xml:space="preserve">weights are interpretable. Crucially, we pair the model with an</w:t>
+        <w:t xml:space="preserve">layer that</w:t>
+      </w:r>
+      <w:r>
+        <w:t xml:space="preserve"> </w:t>
+      </w:r>
+      <w:r>
+        <w:t xml:space="preserve">preserves aspect identity instead of averaging it away. Second, it fuses the modalities</w:t>
+      </w:r>
+      <w:r>
+        <w:t xml:space="preserve"> </w:t>
+      </w:r>
+      <w:r>
+        <w:t xml:space="preserve">with an attention-gated mechanism whose weights are interpretable. Crucially, the model is</w:t>
+      </w:r>
+      <w:r>
+        <w:t xml:space="preserve"> </w:t>
+      </w:r>
+      <w:r>
+        <w:t xml:space="preserve">paired with an</w:t>
       </w:r>
       <w:r>
         <w:t xml:space="preserve"> </w:t>
@@ -720,13 +717,13 @@
         <w:t xml:space="preserve"> </w:t>
       </w:r>
       <w:r>
-        <w:t xml:space="preserve">that toggles the architecture and the signal independently, so that the source of any gain</w:t>
-      </w:r>
-      <w:r>
-        <w:t xml:space="preserve"> </w:t>
-      </w:r>
-      <w:r>
-        <w:t xml:space="preserve">is identified rather than assumed.</w:t>
+        <w:t xml:space="preserve">that toggles the architecture and the signal</w:t>
+      </w:r>
+      <w:r>
+        <w:t xml:space="preserve"> </w:t>
+      </w:r>
+      <w:r>
+        <w:t xml:space="preserve">independently, so that the source of any gain is identified rather than assumed.</w:t>
       </w:r>
     </w:p>
     <w:p>
@@ -805,13 +802,29 @@
         <w:t xml:space="preserve"> </w:t>
       </w:r>
       <w:r>
-        <w:t xml:space="preserve">same model-based aspect features with a static tree, we show the improvement is</w:t>
-      </w:r>
-      <w:r>
-        <w:t xml:space="preserve"> </w:t>
-      </w:r>
-      <w:r>
-        <w:t xml:space="preserve">attributable to the aspect modality, and that the attention mechanism</w:t>
+        <w:t xml:space="preserve">same model-based aspect features with a static tree, we show that the improvement is</w:t>
+      </w:r>
+      <w:r>
+        <w:t xml:space="preserve"> </w:t>
+      </w:r>
+      <w:r>
+        <w:t xml:space="preserve">attributable to the aspect modality. The</w:t>
+      </w:r>
+      <w:r>
+        <w:t xml:space="preserve"> </w:t>
+      </w:r>
+      <w:r>
+        <w:rPr>
+          <w:i/>
+          <w:iCs/>
+        </w:rPr>
+        <w:t xml:space="preserve">modality-fusion</w:t>
+      </w:r>
+      <w:r>
+        <w:t xml:space="preserve"> </w:t>
+      </w:r>
+      <w:r>
+        <w:t xml:space="preserve">attention (Section 4.3)</w:t>
       </w:r>
       <w:r>
         <w:t xml:space="preserve"> </w:t>
@@ -827,19 +840,47 @@
         <w:t xml:space="preserve"> </w:t>
       </w:r>
       <w:r>
-        <w:t xml:space="preserve">rather</w:t>
-      </w:r>
-      <w:r>
-        <w:t xml:space="preserve"> </w:t>
-      </w:r>
-      <w:r>
-        <w:t xml:space="preserve">than beats the static fusion on accuracy — a deliberately falsifiable result that</w:t>
-      </w:r>
-      <w:r>
-        <w:t xml:space="preserve"> </w:t>
-      </w:r>
-      <w:r>
-        <w:t xml:space="preserve">corrects a common mis-attribution.</w:t>
+        <w:t xml:space="preserve">rather than beats the static fusion on accuracy, a deliberately falsifiable</w:t>
+      </w:r>
+      <w:r>
+        <w:t xml:space="preserve"> </w:t>
+      </w:r>
+      <w:r>
+        <w:t xml:space="preserve">result that corrects a common mis-attribution. The</w:t>
+      </w:r>
+      <w:r>
+        <w:t xml:space="preserve"> </w:t>
+      </w:r>
+      <w:r>
+        <w:rPr>
+          <w:i/>
+          <w:iCs/>
+        </w:rPr>
+        <w:t xml:space="preserve">aspect-level</w:t>
+      </w:r>
+      <w:r>
+        <w:t xml:space="preserve"> </w:t>
+      </w:r>
+      <w:r>
+        <w:t xml:space="preserve">attention inside the</w:t>
+      </w:r>
+      <w:r>
+        <w:t xml:space="preserve"> </w:t>
+      </w:r>
+      <w:r>
+        <w:t xml:space="preserve">sentiment encoder (Section 4.2) is a separate mechanism, and its value is established</w:t>
+      </w:r>
+      <w:r>
+        <w:t xml:space="preserve"> </w:t>
+      </w:r>
+      <w:r>
+        <w:t xml:space="preserve">directly. It is what lets the model consume open-vocabulary aspects without</w:t>
+      </w:r>
+      <w:r>
+        <w:t xml:space="preserve"> </w:t>
+      </w:r>
+      <w:r>
+        <w:t xml:space="preserve">hand-engineered features, and it passes a faithfulness test (Section 6.5).</w:t>
       </w:r>
     </w:p>
     <w:p>
@@ -858,19 +899,19 @@
         <w:t xml:space="preserve">A coverage-dependence finding</w:t>
       </w:r>
       <w:r>
-        <w:t xml:space="preserve">: the benefit of model-based ABSA grows as the</w:t>
-      </w:r>
-      <w:r>
-        <w:t xml:space="preserve"> </w:t>
-      </w:r>
-      <w:r>
-        <w:t xml:space="preserve">fixed-taxonomy keyword coverage of a domain falls, giving practical guidance on when the</w:t>
-      </w:r>
-      <w:r>
-        <w:t xml:space="preserve"> </w:t>
-      </w:r>
-      <w:r>
-        <w:t xml:space="preserve">costlier encoder is worth adopting.</w:t>
+        <w:t xml:space="preserve">. The benefit of model-based ABSA grows as the</w:t>
+      </w:r>
+      <w:r>
+        <w:t xml:space="preserve"> </w:t>
+      </w:r>
+      <w:r>
+        <w:t xml:space="preserve">fixed-taxonomy keyword coverage of a domain falls, which gives practical guidance on</w:t>
+      </w:r>
+      <w:r>
+        <w:t xml:space="preserve"> </w:t>
+      </w:r>
+      <w:r>
+        <w:t xml:space="preserve">when the costlier encoder is worth adopting.</w:t>
       </w:r>
     </w:p>
     <w:p>
@@ -889,19 +930,19 @@
         <w:t xml:space="preserve">A validated interpretability analysis</w:t>
       </w:r>
       <w:r>
-        <w:t xml:space="preserve">: we expose per-modality and per-aspect</w:t>
-      </w:r>
-      <w:r>
-        <w:t xml:space="preserve"> </w:t>
-      </w:r>
-      <w:r>
-        <w:t xml:space="preserve">attributions and test the latter with a perturbation study, showing the aspect attention</w:t>
-      </w:r>
-      <w:r>
-        <w:t xml:space="preserve"> </w:t>
-      </w:r>
-      <w:r>
-        <w:t xml:space="preserve">is faithful in the aggregate rather than merely displayed — and we report its limits</w:t>
+        <w:t xml:space="preserve">. We expose per-modality and per-aspect</w:t>
+      </w:r>
+      <w:r>
+        <w:t xml:space="preserve"> </w:t>
+      </w:r>
+      <w:r>
+        <w:t xml:space="preserve">attributions and test the latter with a perturbation study. The aspect attention proves</w:t>
+      </w:r>
+      <w:r>
+        <w:t xml:space="preserve"> </w:t>
+      </w:r>
+      <w:r>
+        <w:t xml:space="preserve">faithful in the aggregate rather than merely displayed, and we report its limits</w:t>
       </w:r>
       <w:r>
         <w:t xml:space="preserve"> </w:t>
@@ -966,25 +1007,25 @@
         <w:t xml:space="preserve">RQ3</w:t>
       </w:r>
       <w:r>
-        <w:t xml:space="preserve">: under what domain conditions does model-based ABSA help most? Section 2 reviews</w:t>
-      </w:r>
-      <w:r>
-        <w:t xml:space="preserve"> </w:t>
-      </w:r>
-      <w:r>
-        <w:t xml:space="preserve">related work; Section 3 formalizes the task; Section 4 details A2-FusionRS; Section 5</w:t>
-      </w:r>
-      <w:r>
-        <w:t xml:space="preserve"> </w:t>
-      </w:r>
-      <w:r>
-        <w:t xml:space="preserve">describes the experimental setup; Section 6 reports and discusses results; Section 7</w:t>
-      </w:r>
-      <w:r>
-        <w:t xml:space="preserve"> </w:t>
-      </w:r>
-      <w:r>
-        <w:t xml:space="preserve">concludes.</w:t>
+        <w:t xml:space="preserve">: under what domain conditions does model-based ABSA help most?</w:t>
+      </w:r>
+      <w:r>
+        <w:t xml:space="preserve"> </w:t>
+      </w:r>
+      <w:r>
+        <w:t xml:space="preserve">Section 2 reviews related work. Section 3 formalizes the task. Section 4 details</w:t>
+      </w:r>
+      <w:r>
+        <w:t xml:space="preserve"> </w:t>
+      </w:r>
+      <w:r>
+        <w:t xml:space="preserve">A2-FusionRS. Section 5 describes the experimental setup. Section 6 reports and discusses</w:t>
+      </w:r>
+      <w:r>
+        <w:t xml:space="preserve"> </w:t>
+      </w:r>
+      <w:r>
+        <w:t xml:space="preserve">results, and Section 7 concludes.</w:t>
       </w:r>
     </w:p>
     <w:p>
@@ -1018,73 +1059,79 @@
         <w:pStyle w:val="FirstParagraph"/>
       </w:pPr>
       <w:r>
-        <w:t xml:space="preserve">The design space of recommender systems is broad and has been surveyed extensively</w:t>
-      </w:r>
-      <w:r>
-        <w:t xml:space="preserve"> </w:t>
-      </w:r>
-      <w:r>
-        <w:t xml:space="preserve">(Saifudin &amp; Widiyaningtyas, 2024); we focus on the rating-prediction line most relevant to</w:t>
-      </w:r>
-      <w:r>
-        <w:t xml:space="preserve"> </w:t>
-      </w:r>
-      <w:r>
-        <w:t xml:space="preserve">this work. Matrix factorization remains the backbone of rating prediction, mapping users and</w:t>
-      </w:r>
-      <w:r>
-        <w:t xml:space="preserve"> </w:t>
-      </w:r>
-      <w:r>
-        <w:t xml:space="preserve">items to latent factors whose inner product estimates a rating (Koren et al., 2009). Neural</w:t>
-      </w:r>
-      <w:r>
-        <w:t xml:space="preserve"> </w:t>
-      </w:r>
-      <w:r>
-        <w:t xml:space="preserve">extensions replace or augment the inner product with learned interaction functions:</w:t>
-      </w:r>
-      <w:r>
-        <w:t xml:space="preserve"> </w:t>
-      </w:r>
-      <w:r>
-        <w:t xml:space="preserve">Neural Collaborative Filtering combines generalized matrix factorization with a multilayer</w:t>
-      </w:r>
-      <w:r>
-        <w:t xml:space="preserve"> </w:t>
-      </w:r>
-      <w:r>
-        <w:t xml:space="preserve">perceptron (He et al., 2017), and DeepFM couples a factorization machine with a deep</w:t>
-      </w:r>
-      <w:r>
-        <w:t xml:space="preserve"> </w:t>
-      </w:r>
-      <w:r>
-        <w:t xml:space="preserve">network to capture low- and high-order feature interactions (Guo et al., 2017). These</w:t>
-      </w:r>
-      <w:r>
-        <w:t xml:space="preserve"> </w:t>
-      </w:r>
-      <w:r>
-        <w:t xml:space="preserve">models are strong when interactions are dense, but their reliance on the interaction</w:t>
-      </w:r>
-      <w:r>
-        <w:t xml:space="preserve"> </w:t>
-      </w:r>
-      <w:r>
-        <w:t xml:space="preserve">signal alone makes them vulnerable to the sparsity and cold-start regimes that characterize</w:t>
-      </w:r>
-      <w:r>
-        <w:t xml:space="preserve"> </w:t>
-      </w:r>
-      <w:r>
-        <w:t xml:space="preserve">review platforms (Idrissi &amp; Zellou, 2020; Yuan &amp; Hernandez, 2023) — a vulnerability our</w:t>
-      </w:r>
-      <w:r>
-        <w:t xml:space="preserve"> </w:t>
-      </w:r>
-      <w:r>
-        <w:t xml:space="preserve">experiments quantify directly, where such models barely exceed a constant-mean predictor.</w:t>
+        <w:t xml:space="preserve">The design space of recommender systems is broad, and it has been surveyed extensively</w:t>
+      </w:r>
+      <w:r>
+        <w:t xml:space="preserve"> </w:t>
+      </w:r>
+      <w:r>
+        <w:t xml:space="preserve">elsewhere (Saifudin &amp; Widiyaningtyas, 2024). We focus here on the rating-prediction line</w:t>
+      </w:r>
+      <w:r>
+        <w:t xml:space="preserve"> </w:t>
+      </w:r>
+      <w:r>
+        <w:t xml:space="preserve">most relevant to this work. Matrix factorization remains the backbone of rating</w:t>
+      </w:r>
+      <w:r>
+        <w:t xml:space="preserve"> </w:t>
+      </w:r>
+      <w:r>
+        <w:t xml:space="preserve">prediction, mapping users and items to latent factors whose inner product estimates a</w:t>
+      </w:r>
+      <w:r>
+        <w:t xml:space="preserve"> </w:t>
+      </w:r>
+      <w:r>
+        <w:t xml:space="preserve">rating (Koren et al., 2009). Neural extensions replace or augment the inner product with</w:t>
+      </w:r>
+      <w:r>
+        <w:t xml:space="preserve"> </w:t>
+      </w:r>
+      <w:r>
+        <w:t xml:space="preserve">learned interaction functions. Neural Collaborative Filtering combines generalized matrix</w:t>
+      </w:r>
+      <w:r>
+        <w:t xml:space="preserve"> </w:t>
+      </w:r>
+      <w:r>
+        <w:t xml:space="preserve">factorization with a multilayer perceptron (He et al., 2017), while DeepFM couples a</w:t>
+      </w:r>
+      <w:r>
+        <w:t xml:space="preserve"> </w:t>
+      </w:r>
+      <w:r>
+        <w:t xml:space="preserve">factorization machine with a deep network to capture low- and high-order feature</w:t>
+      </w:r>
+      <w:r>
+        <w:t xml:space="preserve"> </w:t>
+      </w:r>
+      <w:r>
+        <w:t xml:space="preserve">interactions (Guo et al., 2017). These models are strong when interactions are dense.</w:t>
+      </w:r>
+      <w:r>
+        <w:t xml:space="preserve"> </w:t>
+      </w:r>
+      <w:r>
+        <w:t xml:space="preserve">Their reliance on the interaction signal alone, however, makes them vulnerable to the</w:t>
+      </w:r>
+      <w:r>
+        <w:t xml:space="preserve"> </w:t>
+      </w:r>
+      <w:r>
+        <w:t xml:space="preserve">sparsity and cold-start regimes that characterize review platforms (Idrissi &amp; Zellou,</w:t>
+      </w:r>
+      <w:r>
+        <w:t xml:space="preserve"> </w:t>
+      </w:r>
+      <w:r>
+        <w:t xml:space="preserve">2020; Yuan &amp; Hernandez, 2023). Our experiments quantify this vulnerability directly:</w:t>
+      </w:r>
+      <w:r>
+        <w:t xml:space="preserve"> </w:t>
+      </w:r>
+      <w:r>
+        <w:t xml:space="preserve">such models barely exceed a constant-mean predictor.</w:t>
       </w:r>
     </w:p>
     <w:bookmarkEnd w:id="11"/>
@@ -1108,79 +1155,79 @@
         <w:t xml:space="preserve"> </w:t>
       </w:r>
       <w:r>
-        <w:t xml:space="preserve">text. Early hybrids inject document-level sentiment or topic features into a factorization</w:t>
-      </w:r>
-      <w:r>
-        <w:t xml:space="preserve"> </w:t>
-      </w:r>
-      <w:r>
-        <w:t xml:space="preserve">model (Elahi et al., 2023; Lai &amp; Hsu, 2021), while later methods learn joint</w:t>
-      </w:r>
-      <w:r>
-        <w:t xml:space="preserve"> </w:t>
-      </w:r>
-      <w:r>
-        <w:t xml:space="preserve">representations of reviews and ratings (Cai et al., 2022; Duan et al., 2022; Lai &amp; Peng, 2023)</w:t>
-      </w:r>
-      <w:r>
-        <w:t xml:space="preserve"> </w:t>
-      </w:r>
-      <w:r>
-        <w:t xml:space="preserve">or add further modalities such as product images (Zhan &amp; Xu, 2023). A recurring theme is that reviews</w:t>
-      </w:r>
-      <w:r>
-        <w:t xml:space="preserve"> </w:t>
-      </w:r>
-      <w:r>
-        <w:t xml:space="preserve">mitigate sparsity and cold-start: review-based collaborative filtering and matrix</w:t>
-      </w:r>
-      <w:r>
-        <w:t xml:space="preserve"> </w:t>
-      </w:r>
-      <w:r>
-        <w:t xml:space="preserve">factorization have been combined explicitly to address rating sparsity (Duan et al.,</w:t>
-      </w:r>
-      <w:r>
-        <w:t xml:space="preserve"> </w:t>
-      </w:r>
-      <w:r>
-        <w:t xml:space="preserve">2022), and stacked-autoencoder and ensemble models exploit reviews for top-N</w:t>
-      </w:r>
-      <w:r>
-        <w:t xml:space="preserve"> </w:t>
-      </w:r>
-      <w:r>
-        <w:t xml:space="preserve">recommendation on sparse corpora (Abinaya &amp; Devi, 2021; Choudhary et al., 2023).</w:t>
-      </w:r>
-      <w:r>
-        <w:t xml:space="preserve"> </w:t>
-      </w:r>
-      <w:r>
-        <w:t xml:space="preserve">Transformer language models have further sharpened the text representation, with BERT</w:t>
-      </w:r>
-      <w:r>
-        <w:t xml:space="preserve"> </w:t>
-      </w:r>
-      <w:r>
-        <w:t xml:space="preserve">embeddings of reviews feeding hybrid recommenders in the immediate lineage of the present</w:t>
-      </w:r>
-      <w:r>
-        <w:t xml:space="preserve"> </w:t>
-      </w:r>
-      <w:r>
-        <w:t xml:space="preserve">work (Karabila et al., 2023, 2025). These methods establish that the review channel is</w:t>
-      </w:r>
-      <w:r>
-        <w:t xml:space="preserve"> </w:t>
-      </w:r>
-      <w:r>
-        <w:t xml:space="preserve">valuable; they largely treat sentiment at the document or sentence level (e.g., Yang et al.,</w:t>
-      </w:r>
-      <w:r>
-        <w:t xml:space="preserve"> </w:t>
-      </w:r>
-      <w:r>
-        <w:t xml:space="preserve">2021), however, leaving the finer aspect structure underused.</w:t>
+        <w:t xml:space="preserve">text. Early hybrids inject document-level sentiment or topic features into a</w:t>
+      </w:r>
+      <w:r>
+        <w:t xml:space="preserve"> </w:t>
+      </w:r>
+      <w:r>
+        <w:t xml:space="preserve">factorization model (Elahi et al., 2023; Lai &amp; Hsu, 2021). Later methods learn joint</w:t>
+      </w:r>
+      <w:r>
+        <w:t xml:space="preserve"> </w:t>
+      </w:r>
+      <w:r>
+        <w:t xml:space="preserve">representations of reviews and ratings (Cai et al., 2022; Duan et al., 2022; Lai &amp; Peng,</w:t>
+      </w:r>
+      <w:r>
+        <w:t xml:space="preserve"> </w:t>
+      </w:r>
+      <w:r>
+        <w:t xml:space="preserve">2023), or add further modalities such as product images (Zhan &amp; Xu, 2023). A recurring</w:t>
+      </w:r>
+      <w:r>
+        <w:t xml:space="preserve"> </w:t>
+      </w:r>
+      <w:r>
+        <w:t xml:space="preserve">theme across this literature is that reviews mitigate sparsity and cold-start. Review-based</w:t>
+      </w:r>
+      <w:r>
+        <w:t xml:space="preserve"> </w:t>
+      </w:r>
+      <w:r>
+        <w:t xml:space="preserve">collaborative filtering and matrix factorization have been combined explicitly to address</w:t>
+      </w:r>
+      <w:r>
+        <w:t xml:space="preserve"> </w:t>
+      </w:r>
+      <w:r>
+        <w:t xml:space="preserve">rating sparsity (Duan et al., 2022), and stacked-autoencoder and ensemble models exploit</w:t>
+      </w:r>
+      <w:r>
+        <w:t xml:space="preserve"> </w:t>
+      </w:r>
+      <w:r>
+        <w:t xml:space="preserve">reviews for top-N recommendation on sparse corpora (Abinaya &amp; Devi, 2021; Choudhary et al.,</w:t>
+      </w:r>
+      <w:r>
+        <w:t xml:space="preserve"> </w:t>
+      </w:r>
+      <w:r>
+        <w:t xml:space="preserve">2023). Transformer language models have further sharpened the text representation, with</w:t>
+      </w:r>
+      <w:r>
+        <w:t xml:space="preserve"> </w:t>
+      </w:r>
+      <w:r>
+        <w:t xml:space="preserve">BERT embeddings of reviews feeding hybrid recommenders in the immediate lineage of the</w:t>
+      </w:r>
+      <w:r>
+        <w:t xml:space="preserve"> </w:t>
+      </w:r>
+      <w:r>
+        <w:t xml:space="preserve">present work (Karabila et al., 2023, 2025). These methods establish that the review</w:t>
+      </w:r>
+      <w:r>
+        <w:t xml:space="preserve"> </w:t>
+      </w:r>
+      <w:r>
+        <w:t xml:space="preserve">channel is valuable. They largely treat sentiment at the document or sentence level,</w:t>
+      </w:r>
+      <w:r>
+        <w:t xml:space="preserve"> </w:t>
+      </w:r>
+      <w:r>
+        <w:t xml:space="preserve">however (e.g., Yang et al., 2021), leaving the finer aspect structure underused.</w:t>
       </w:r>
     </w:p>
     <w:bookmarkEnd w:id="12"/>
@@ -1198,67 +1245,67 @@
         <w:pStyle w:val="FirstParagraph"/>
       </w:pPr>
       <w:r>
-        <w:t xml:space="preserve">A finer-grained strand extracts aspect-level sentiment and feeds it to the recommender.</w:t>
-      </w:r>
-      <w:r>
-        <w:t xml:space="preserve"> </w:t>
-      </w:r>
-      <w:r>
-        <w:t xml:space="preserve">Approaches range from clustering users by aspect sentiment (Poudel &amp; Bikdash, 2022) and</w:t>
-      </w:r>
-      <w:r>
-        <w:t xml:space="preserve"> </w:t>
-      </w:r>
-      <w:r>
-        <w:t xml:space="preserve">attention over aspect terms (Lai et al., 2021; Yang et al., 2024b), to aspect-aware graph</w:t>
-      </w:r>
-      <w:r>
-        <w:t xml:space="preserve"> </w:t>
-      </w:r>
-      <w:r>
-        <w:t xml:space="preserve">neural networks (Zhang et al., 2023), knowledge-graph models driven by review sentiment</w:t>
-      </w:r>
-      <w:r>
-        <w:t xml:space="preserve"> </w:t>
-      </w:r>
-      <w:r>
-        <w:t xml:space="preserve">(Cui et al., 2024), variational aspect-level models (Ou &amp; Huynh, 2024), and, most recently,</w:t>
-      </w:r>
-      <w:r>
-        <w:t xml:space="preserve"> </w:t>
-      </w:r>
-      <w:r>
-        <w:t xml:space="preserve">LLM-based aspect extraction (Liu et al., 2025). Several report that aspect-level signals</w:t>
-      </w:r>
-      <w:r>
-        <w:t xml:space="preserve"> </w:t>
-      </w:r>
-      <w:r>
-        <w:t xml:space="preserve">outperform overall-sentiment baselines (Kim et al., 2024; Yang et al., 2024a). Two</w:t>
-      </w:r>
-      <w:r>
-        <w:t xml:space="preserve"> </w:t>
-      </w:r>
-      <w:r>
-        <w:t xml:space="preserve">limitations persist. Most systems still derive aspects from a fixed taxonomy or a</w:t>
-      </w:r>
-      <w:r>
-        <w:t xml:space="preserve"> </w:t>
-      </w:r>
-      <w:r>
-        <w:t xml:space="preserve">domain-specific list, so their coverage is domain-bound; and where an open-vocabulary</w:t>
-      </w:r>
-      <w:r>
-        <w:t xml:space="preserve"> </w:t>
-      </w:r>
-      <w:r>
-        <w:t xml:space="preserve">extractor is used, its variable-length aspect set is typically reduced by averaging or</w:t>
-      </w:r>
-      <w:r>
-        <w:t xml:space="preserve"> </w:t>
-      </w:r>
-      <w:r>
-        <w:t xml:space="preserve">simple pooling, which discards the polarity contrast</w:t>
+        <w:t xml:space="preserve">A finer-grained strand of research extracts aspect-level sentiment and feeds it to the</w:t>
+      </w:r>
+      <w:r>
+        <w:t xml:space="preserve"> </w:t>
+      </w:r>
+      <w:r>
+        <w:t xml:space="preserve">recommender. Approaches range from clustering users by aspect sentiment (Poudel &amp;</w:t>
+      </w:r>
+      <w:r>
+        <w:t xml:space="preserve"> </w:t>
+      </w:r>
+      <w:r>
+        <w:t xml:space="preserve">Bikdash, 2022) and attention over aspect terms (Lai et al., 2021; Yang et al., 2024b), to</w:t>
+      </w:r>
+      <w:r>
+        <w:t xml:space="preserve"> </w:t>
+      </w:r>
+      <w:r>
+        <w:t xml:space="preserve">aspect-aware graph neural networks (Zhang et al., 2023), knowledge-graph models driven by</w:t>
+      </w:r>
+      <w:r>
+        <w:t xml:space="preserve"> </w:t>
+      </w:r>
+      <w:r>
+        <w:t xml:space="preserve">review sentiment (Cui et al., 2024), variational aspect-level models (Ou &amp; Huynh, 2024),</w:t>
+      </w:r>
+      <w:r>
+        <w:t xml:space="preserve"> </w:t>
+      </w:r>
+      <w:r>
+        <w:t xml:space="preserve">and, most recently, LLM-based aspect extraction (Liu et al., 2025). Several studies report</w:t>
+      </w:r>
+      <w:r>
+        <w:t xml:space="preserve"> </w:t>
+      </w:r>
+      <w:r>
+        <w:t xml:space="preserve">that aspect-level signals outperform overall-sentiment baselines (Kim et al., 2024; Yang</w:t>
+      </w:r>
+      <w:r>
+        <w:t xml:space="preserve"> </w:t>
+      </w:r>
+      <w:r>
+        <w:t xml:space="preserve">et al., 2024a). Two limitations persist across this strand. Most systems still derive</w:t>
+      </w:r>
+      <w:r>
+        <w:t xml:space="preserve"> </w:t>
+      </w:r>
+      <w:r>
+        <w:t xml:space="preserve">aspects from a fixed taxonomy or a domain-specific list, so their coverage remains</w:t>
+      </w:r>
+      <w:r>
+        <w:t xml:space="preserve"> </w:t>
+      </w:r>
+      <w:r>
+        <w:t xml:space="preserve">domain-bound. Where an open-vocabulary extractor is used, its variable-length aspect set</w:t>
+      </w:r>
+      <w:r>
+        <w:t xml:space="preserve"> </w:t>
+      </w:r>
+      <w:r>
+        <w:t xml:space="preserve">is typically reduced by averaging or simple pooling, which discards the polarity contrast</w:t>
       </w:r>
       <w:r>
         <w:t xml:space="preserve"> </w:t>
@@ -1274,37 +1321,37 @@
         <w:t xml:space="preserve"> </w:t>
       </w:r>
       <w:r>
-        <w:t xml:space="preserve">aspects. Model-based ABSA</w:t>
-      </w:r>
-      <w:r>
-        <w:t xml:space="preserve"> </w:t>
-      </w:r>
-      <w:r>
-        <w:t xml:space="preserve">toolkits such as PyABSA (Yang &amp; Li, 2023) make open-vocabulary extraction practical, but</w:t>
-      </w:r>
-      <w:r>
-        <w:t xml:space="preserve"> </w:t>
-      </w:r>
-      <w:r>
-        <w:t xml:space="preserve">how best to represent their per-aspect output for a recommender — and when the extra cost</w:t>
-      </w:r>
-      <w:r>
-        <w:t xml:space="preserve"> </w:t>
-      </w:r>
-      <w:r>
-        <w:t xml:space="preserve">is justified — remains open. A2-FusionRS addresses the representation question with a</w:t>
-      </w:r>
-      <w:r>
-        <w:t xml:space="preserve"> </w:t>
-      </w:r>
-      <w:r>
-        <w:t xml:space="preserve">learned aspect-sequence pooling that keeps aspect identity, and the cost question with the</w:t>
-      </w:r>
-      <w:r>
-        <w:t xml:space="preserve"> </w:t>
-      </w:r>
-      <w:r>
-        <w:t xml:space="preserve">coverage-dependence analysis of Section 6.4.</w:t>
+        <w:t xml:space="preserve">aspects. Model-based ABSA toolkits such as PyABSA (Yang &amp; Li, 2023) make</w:t>
+      </w:r>
+      <w:r>
+        <w:t xml:space="preserve"> </w:t>
+      </w:r>
+      <w:r>
+        <w:t xml:space="preserve">open-vocabulary extraction practical. How best to represent their per-aspect output for a</w:t>
+      </w:r>
+      <w:r>
+        <w:t xml:space="preserve"> </w:t>
+      </w:r>
+      <w:r>
+        <w:t xml:space="preserve">recommender, and when the extra cost is justified, remains an open question. A2-FusionRS</w:t>
+      </w:r>
+      <w:r>
+        <w:t xml:space="preserve"> </w:t>
+      </w:r>
+      <w:r>
+        <w:t xml:space="preserve">addresses the representation question with a learned aspect-sequence pooling that keeps</w:t>
+      </w:r>
+      <w:r>
+        <w:t xml:space="preserve"> </w:t>
+      </w:r>
+      <w:r>
+        <w:t xml:space="preserve">aspect identity, and it addresses the cost question with the coverage-dependence analysis</w:t>
+      </w:r>
+      <w:r>
+        <w:t xml:space="preserve"> </w:t>
+      </w:r>
+      <w:r>
+        <w:t xml:space="preserve">of Section 6.4.</w:t>
       </w:r>
     </w:p>
     <w:bookmarkEnd w:id="13"/>
@@ -1374,31 +1421,31 @@
         <w:t xml:space="preserve"> </w:t>
       </w:r>
       <w:r>
-        <w:t xml:space="preserve">or exceed simpler combiners; what it rarely does is isolate the fusion mechanism’s</w:t>
-      </w:r>
-      <w:r>
-        <w:t xml:space="preserve"> </w:t>
-      </w:r>
-      <w:r>
-        <w:t xml:space="preserve">contribution from that of the signals it fuses. Because new architectures and new signals</w:t>
-      </w:r>
-      <w:r>
-        <w:t xml:space="preserve"> </w:t>
-      </w:r>
-      <w:r>
-        <w:t xml:space="preserve">are usually introduced together, the community’s implicit attribution of gains to the</w:t>
-      </w:r>
-      <w:r>
-        <w:t xml:space="preserve"> </w:t>
-      </w:r>
-      <w:r>
-        <w:t xml:space="preserve">fusion mechanism has seldom been tested against a same-signal control — the gap our</w:t>
-      </w:r>
-      <w:r>
-        <w:t xml:space="preserve"> </w:t>
-      </w:r>
-      <w:r>
-        <w:t xml:space="preserve">attribution protocol is designed to close.</w:t>
+        <w:t xml:space="preserve">or exceed simpler combiners. What it rarely does is isolate the fusion mechanism’s</w:t>
+      </w:r>
+      <w:r>
+        <w:t xml:space="preserve"> </w:t>
+      </w:r>
+      <w:r>
+        <w:t xml:space="preserve">contribution from that of the signals it fuses. New architectures and new signals are</w:t>
+      </w:r>
+      <w:r>
+        <w:t xml:space="preserve"> </w:t>
+      </w:r>
+      <w:r>
+        <w:t xml:space="preserve">usually introduced together, so the community’s implicit attribution of gains to the</w:t>
+      </w:r>
+      <w:r>
+        <w:t xml:space="preserve"> </w:t>
+      </w:r>
+      <w:r>
+        <w:t xml:space="preserve">fusion mechanism has seldom been tested against a same-signal control. Closing this gap</w:t>
+      </w:r>
+      <w:r>
+        <w:t xml:space="preserve"> </w:t>
+      </w:r>
+      <w:r>
+        <w:t xml:space="preserve">is precisely what our attribution protocol is designed to do.</w:t>
       </w:r>
     </w:p>
     <w:bookmarkEnd w:id="14"/>
@@ -1432,61 +1479,61 @@
         <w:t xml:space="preserve"> </w:t>
       </w:r>
       <w:r>
-        <w:t xml:space="preserve">a recommendation is made has grown alongside accuracy, and reviews are a</w:t>
-      </w:r>
-      <w:r>
-        <w:t xml:space="preserve"> </w:t>
-      </w:r>
-      <w:r>
-        <w:t xml:space="preserve">natural source of explanations. Recent systems attach aspect- or word-level attributions</w:t>
-      </w:r>
-      <w:r>
-        <w:t xml:space="preserve"> </w:t>
-      </w:r>
-      <w:r>
-        <w:t xml:space="preserve">to their predictions (Kim et al., 2024; Wu et al., 2024), reconstruct explanatory factors</w:t>
-      </w:r>
-      <w:r>
-        <w:t xml:space="preserve"> </w:t>
-      </w:r>
-      <w:r>
-        <w:t xml:space="preserve">in a factorization model (Chang et al., 2024), or survey the broader space of explainable</w:t>
-      </w:r>
-      <w:r>
-        <w:t xml:space="preserve"> </w:t>
-      </w:r>
-      <w:r>
-        <w:t xml:space="preserve">recommenders (Tiwary et al., 2024). A caution from the NLP literature applies throughout:</w:t>
-      </w:r>
-      <w:r>
-        <w:t xml:space="preserve"> </w:t>
-      </w:r>
-      <w:r>
-        <w:t xml:space="preserve">attention weights are not automatically faithful explanations, and treating an attention</w:t>
-      </w:r>
-      <w:r>
-        <w:t xml:space="preserve"> </w:t>
-      </w:r>
-      <w:r>
-        <w:t xml:space="preserve">heatmap as proof of what a model used is unsafe without a faithfulness test (Jain &amp;</w:t>
-      </w:r>
-      <w:r>
-        <w:t xml:space="preserve"> </w:t>
-      </w:r>
-      <w:r>
-        <w:t xml:space="preserve">Wallace, 2019; Wiegreffe &amp; Pinter, 2019). We take this caution seriously, validating our</w:t>
-      </w:r>
-      <w:r>
-        <w:t xml:space="preserve"> </w:t>
-      </w:r>
-      <w:r>
-        <w:t xml:space="preserve">aspect attributions with a perturbation study (Section 6.5) rather than presenting them as</w:t>
-      </w:r>
-      <w:r>
-        <w:t xml:space="preserve"> </w:t>
-      </w:r>
-      <w:r>
-        <w:t xml:space="preserve">self-evident.</w:t>
+        <w:t xml:space="preserve">a recommendation is made has grown alongside interest in accuracy, and</w:t>
+      </w:r>
+      <w:r>
+        <w:t xml:space="preserve"> </w:t>
+      </w:r>
+      <w:r>
+        <w:t xml:space="preserve">reviews are a natural source of explanations. Recent systems attach aspect- or word-level</w:t>
+      </w:r>
+      <w:r>
+        <w:t xml:space="preserve"> </w:t>
+      </w:r>
+      <w:r>
+        <w:t xml:space="preserve">attributions to their predictions (Kim et al., 2024; Wu et al., 2024), reconstruct</w:t>
+      </w:r>
+      <w:r>
+        <w:t xml:space="preserve"> </w:t>
+      </w:r>
+      <w:r>
+        <w:t xml:space="preserve">explanatory factors in a factorization model (Chang et al., 2024), or survey the broader</w:t>
+      </w:r>
+      <w:r>
+        <w:t xml:space="preserve"> </w:t>
+      </w:r>
+      <w:r>
+        <w:t xml:space="preserve">space of explainable recommenders (Tiwary et al., 2024). A caution from the NLP literature</w:t>
+      </w:r>
+      <w:r>
+        <w:t xml:space="preserve"> </w:t>
+      </w:r>
+      <w:r>
+        <w:t xml:space="preserve">applies throughout this line of work. Attention weights are not automatically faithful</w:t>
+      </w:r>
+      <w:r>
+        <w:t xml:space="preserve"> </w:t>
+      </w:r>
+      <w:r>
+        <w:t xml:space="preserve">explanations, and treating an attention heatmap as proof of what a model used is unsafe</w:t>
+      </w:r>
+      <w:r>
+        <w:t xml:space="preserve"> </w:t>
+      </w:r>
+      <w:r>
+        <w:t xml:space="preserve">without a faithfulness test (Jain &amp; Wallace, 2019; Wiegreffe &amp; Pinter, 2019). We take this</w:t>
+      </w:r>
+      <w:r>
+        <w:t xml:space="preserve"> </w:t>
+      </w:r>
+      <w:r>
+        <w:t xml:space="preserve">caution seriously here, validating our aspect attributions with a perturbation study</w:t>
+      </w:r>
+      <w:r>
+        <w:t xml:space="preserve"> </w:t>
+      </w:r>
+      <w:r>
+        <w:t xml:space="preserve">(Section 6.5) rather than presenting them as self-evident.</w:t>
       </w:r>
     </w:p>
     <w:bookmarkEnd w:id="15"/>
@@ -1504,13 +1551,19 @@
         <w:pStyle w:val="FirstParagraph"/>
       </w:pPr>
       <w:r>
-        <w:t xml:space="preserve">Across these strands, two things are largely missing and together define our contribution.</w:t>
-      </w:r>
-      <w:r>
-        <w:t xml:space="preserve"> </w:t>
-      </w:r>
-      <w:r>
-        <w:t xml:space="preserve">First, when a review or aspect signal improves a recommender, the improvement is rarely</w:t>
+        <w:t xml:space="preserve">Across these strands, two things are largely missing, and together they define our</w:t>
+      </w:r>
+      <w:r>
+        <w:t xml:space="preserve"> </w:t>
+      </w:r>
+      <w:r>
+        <w:t xml:space="preserve">contribution. First, when a review or aspect signal improves a recommender, the</w:t>
+      </w:r>
+      <w:r>
+        <w:t xml:space="preserve"> </w:t>
+      </w:r>
+      <w:r>
+        <w:t xml:space="preserve">improvement is rarely</w:t>
       </w:r>
       <w:r>
         <w:t xml:space="preserve"> </w:t>
@@ -1526,79 +1579,79 @@
         <w:t xml:space="preserve"> </w:t>
       </w:r>
       <w:r>
-        <w:t xml:space="preserve">to a source through a same-signal, different-architecture control; the</w:t>
-      </w:r>
-      <w:r>
-        <w:t xml:space="preserve"> </w:t>
-      </w:r>
-      <w:r>
-        <w:t xml:space="preserve">prevailing assumption that elaborate fusion drives gains is mostly untested. Second, the</w:t>
-      </w:r>
-      <w:r>
-        <w:t xml:space="preserve"> </w:t>
-      </w:r>
-      <w:r>
-        <w:t xml:space="preserve">value of open-vocabulary model-based ABSA is seldom analyzed as a function of a domain’s</w:t>
-      </w:r>
-      <w:r>
-        <w:t xml:space="preserve"> </w:t>
-      </w:r>
-      <w:r>
-        <w:t xml:space="preserve">existing aspect coverage, so there is little guidance on when it is worth its cost. Table 1</w:t>
-      </w:r>
-      <w:r>
-        <w:t xml:space="preserve"> </w:t>
-      </w:r>
-      <w:r>
-        <w:t xml:space="preserve">positions representative review-aware recommenders on the axes that matter here — the</w:t>
-      </w:r>
-      <w:r>
-        <w:t xml:space="preserve"> </w:t>
-      </w:r>
-      <w:r>
-        <w:t xml:space="preserve">aspect vocabulary, the fusion mechanism, whether the gain is attributed through a control,</w:t>
-      </w:r>
-      <w:r>
-        <w:t xml:space="preserve"> </w:t>
-      </w:r>
-      <w:r>
-        <w:t xml:space="preserve">and whether interpretability is validated — and locates our contribution against them.</w:t>
-      </w:r>
-      <w:r>
-        <w:t xml:space="preserve"> </w:t>
-      </w:r>
-      <w:r>
-        <w:t xml:space="preserve">A2-FusionRS is built to address both gaps: it introduces model-based per-aspect sentiment as a</w:t>
-      </w:r>
-      <w:r>
-        <w:t xml:space="preserve"> </w:t>
-      </w:r>
-      <w:r>
-        <w:t xml:space="preserve">complementary modality with an identity-preserving pooling layer, but it is accompanied by</w:t>
-      </w:r>
-      <w:r>
-        <w:t xml:space="preserve"> </w:t>
-      </w:r>
-      <w:r>
-        <w:t xml:space="preserve">an attribution protocol that credits the resulting gain to the signal rather than the</w:t>
-      </w:r>
-      <w:r>
-        <w:t xml:space="preserve"> </w:t>
-      </w:r>
-      <w:r>
-        <w:t xml:space="preserve">architecture, a coverage-dependence analysis that says when the signal helps, and a</w:t>
-      </w:r>
-      <w:r>
-        <w:t xml:space="preserve"> </w:t>
-      </w:r>
-      <w:r>
-        <w:t xml:space="preserve">faithfulness-tested interpretability account. The result is a system that improves over</w:t>
-      </w:r>
-      <w:r>
-        <w:t xml:space="preserve"> </w:t>
-      </w:r>
-      <w:r>
-        <w:t xml:space="preserve">strong baselines</w:t>
+        <w:t xml:space="preserve">to a source through a same-signal,</w:t>
+      </w:r>
+      <w:r>
+        <w:t xml:space="preserve"> </w:t>
+      </w:r>
+      <w:r>
+        <w:t xml:space="preserve">different-architecture control. The prevailing assumption that elaborate fusion drives</w:t>
+      </w:r>
+      <w:r>
+        <w:t xml:space="preserve"> </w:t>
+      </w:r>
+      <w:r>
+        <w:t xml:space="preserve">gains is mostly untested. Second, the value of open-vocabulary model-based ABSA is seldom</w:t>
+      </w:r>
+      <w:r>
+        <w:t xml:space="preserve"> </w:t>
+      </w:r>
+      <w:r>
+        <w:t xml:space="preserve">analyzed as a function of a domain’s existing aspect coverage, so there is little guidance</w:t>
+      </w:r>
+      <w:r>
+        <w:t xml:space="preserve"> </w:t>
+      </w:r>
+      <w:r>
+        <w:t xml:space="preserve">on when it is worth its cost. Table 1 positions representative review-aware recommenders</w:t>
+      </w:r>
+      <w:r>
+        <w:t xml:space="preserve"> </w:t>
+      </w:r>
+      <w:r>
+        <w:t xml:space="preserve">on the axes that matter here: the aspect vocabulary, the fusion mechanism, whether the</w:t>
+      </w:r>
+      <w:r>
+        <w:t xml:space="preserve"> </w:t>
+      </w:r>
+      <w:r>
+        <w:t xml:space="preserve">gain is attributed through a control, and whether interpretability is validated. It</w:t>
+      </w:r>
+      <w:r>
+        <w:t xml:space="preserve"> </w:t>
+      </w:r>
+      <w:r>
+        <w:t xml:space="preserve">locates our contribution against them. A2-FusionRS is built to address both gaps. It</w:t>
+      </w:r>
+      <w:r>
+        <w:t xml:space="preserve"> </w:t>
+      </w:r>
+      <w:r>
+        <w:t xml:space="preserve">introduces model-based per-aspect sentiment as a complementary modality with an</w:t>
+      </w:r>
+      <w:r>
+        <w:t xml:space="preserve"> </w:t>
+      </w:r>
+      <w:r>
+        <w:t xml:space="preserve">identity-preserving pooling layer, and it is accompanied by an attribution protocol that</w:t>
+      </w:r>
+      <w:r>
+        <w:t xml:space="preserve"> </w:t>
+      </w:r>
+      <w:r>
+        <w:t xml:space="preserve">credits the resulting gain to the signal rather than the architecture, a</w:t>
+      </w:r>
+      <w:r>
+        <w:t xml:space="preserve"> </w:t>
+      </w:r>
+      <w:r>
+        <w:t xml:space="preserve">coverage-dependence analysis that says when the signal helps, and a faithfulness-tested</w:t>
+      </w:r>
+      <w:r>
+        <w:t xml:space="preserve"> </w:t>
+      </w:r>
+      <w:r>
+        <w:t xml:space="preserve">interpretability account. The result is a system that improves over strong baselines</w:t>
       </w:r>
       <w:r>
         <w:t xml:space="preserve"> </w:t>
@@ -1614,7 +1667,7 @@
         <w:t xml:space="preserve"> </w:t>
       </w:r>
       <w:r>
-        <w:t xml:space="preserve">an honest account of why.</w:t>
+        <w:t xml:space="preserve">offers an honest account of why.</w:t>
       </w:r>
     </w:p>
     <w:p>
@@ -3552,25 +3605,25 @@
         <w:pStyle w:val="FirstParagraph"/>
       </w:pPr>
       <w:r>
-        <w:t xml:space="preserve">A2-FusionRS draws on three complementary views of each interaction, reused from</w:t>
-      </w:r>
-      <w:r>
-        <w:t xml:space="preserve"> </w:t>
-      </w:r>
-      <w:r>
-        <w:t xml:space="preserve">A2-IRM — our own prior static-fusion hybrid (deep matrix factorization, content-based</w:t>
-      </w:r>
-      <w:r>
-        <w:t xml:space="preserve"> </w:t>
-      </w:r>
-      <w:r>
-        <w:t xml:space="preserve">clustering, and NMF + decision-tree fusion), built in the lineage of Darraz et al.</w:t>
-      </w:r>
-      <w:r>
-        <w:t xml:space="preserve"> </w:t>
-      </w:r>
-      <w:r>
-        <w:t xml:space="preserve">(2025) and used here as the Phase-1 predecessor — and extended here:</w:t>
+        <w:t xml:space="preserve">A2-FusionRS draws on three complementary views of each interaction, reused from A2-IRM and</w:t>
+      </w:r>
+      <w:r>
+        <w:t xml:space="preserve"> </w:t>
+      </w:r>
+      <w:r>
+        <w:t xml:space="preserve">extended here. A2-IRM is our own prior static-fusion hybrid, combining deep matrix</w:t>
+      </w:r>
+      <w:r>
+        <w:t xml:space="preserve"> </w:t>
+      </w:r>
+      <w:r>
+        <w:t xml:space="preserve">factorization, content-based clustering, and NMF + decision-tree fusion. It was built in</w:t>
+      </w:r>
+      <w:r>
+        <w:t xml:space="preserve"> </w:t>
+      </w:r>
+      <w:r>
+        <w:t xml:space="preserve">the lineage of Darraz et al. (2025) and serves here as the Phase-1 predecessor:</w:t>
       </w:r>
     </w:p>
     <w:p>
@@ -3878,13 +3931,13 @@
         <w:t xml:space="preserve"> </w:t>
       </w:r>
       <w:r>
-        <w:t xml:space="preserve">A2-IRM; the model-based per-aspect signal is the additional modality introduced in</w:t>
-      </w:r>
-      <w:r>
-        <w:t xml:space="preserve"> </w:t>
-      </w:r>
-      <w:r>
-        <w:t xml:space="preserve">this work.</w:t>
+        <w:t xml:space="preserve">A2-IRM. The model-based per-aspect signal is the additional modality introduced in this</w:t>
+      </w:r>
+      <w:r>
+        <w:t xml:space="preserve"> </w:t>
+      </w:r>
+      <w:r>
+        <w:t xml:space="preserve">work.</w:t>
       </w:r>
     </w:p>
     <w:p>
@@ -3919,25 +3972,25 @@
         <w:pStyle w:val="FirstParagraph"/>
       </w:pPr>
       <w:r>
-        <w:t xml:space="preserve">Figure 1 shows the architecture. A2-FusionRS encodes each interaction into four</w:t>
-      </w:r>
-      <w:r>
-        <w:t xml:space="preserve"> </w:t>
-      </w:r>
-      <w:r>
-        <w:t xml:space="preserve">modality tokens, contextualizes them with multi-head cross-attention, and combines</w:t>
-      </w:r>
-      <w:r>
-        <w:t xml:space="preserve"> </w:t>
-      </w:r>
-      <w:r>
-        <w:t xml:space="preserve">them through a gated pooling layer whose per-modality weights are interpretable. The</w:t>
-      </w:r>
-      <w:r>
-        <w:t xml:space="preserve"> </w:t>
-      </w:r>
-      <w:r>
-        <w:t xml:space="preserve">pooled representation drives a small prediction head that outputs an</w:t>
+        <w:t xml:space="preserve">Figure 1 shows the architecture. A2-FusionRS encodes each interaction into four modality</w:t>
+      </w:r>
+      <w:r>
+        <w:t xml:space="preserve"> </w:t>
+      </w:r>
+      <w:r>
+        <w:t xml:space="preserve">tokens, contextualizes them with multi-head cross-attention, and combines them through a</w:t>
+      </w:r>
+      <w:r>
+        <w:t xml:space="preserve"> </w:t>
+      </w:r>
+      <w:r>
+        <w:t xml:space="preserve">gated pooling layer whose per-modality weights are interpretable. The pooled</w:t>
+      </w:r>
+      <w:r>
+        <w:t xml:space="preserve"> </w:t>
+      </w:r>
+      <w:r>
+        <w:t xml:space="preserve">representation then drives a small prediction head that outputs an</w:t>
       </w:r>
       <w:r>
         <w:t xml:space="preserve"> </w:t>
@@ -3967,13 +4020,13 @@
         <w:t xml:space="preserve"> </w:t>
       </w:r>
       <w:r>
-        <w:t xml:space="preserve">on top of a static fusion base, so the model learns only the residual</w:t>
-      </w:r>
-      <w:r>
-        <w:t xml:space="preserve"> </w:t>
-      </w:r>
-      <w:r>
-        <w:t xml:space="preserve">that the base cannot already explain.</w:t>
+        <w:t xml:space="preserve">on top of a static fusion base. In this way, the model learns only the</w:t>
+      </w:r>
+      <w:r>
+        <w:t xml:space="preserve"> </w:t>
+      </w:r>
+      <w:r>
+        <w:t xml:space="preserve">residual that the base cannot already explain.</w:t>
       </w:r>
     </w:p>
     <w:p>
@@ -3981,7 +4034,13 @@
         <w:pStyle w:val="BodyText"/>
       </w:pPr>
       <w:r>
-        <w:t xml:space="preserve">Two design choices distinguish the encoder stage. First, the representation is</w:t>
+        <w:t xml:space="preserve">Two design choices distinguish the encoder stage. The first concerns the representation,</w:t>
+      </w:r>
+      <w:r>
+        <w:t xml:space="preserve"> </w:t>
+      </w:r>
+      <w:r>
+        <w:t xml:space="preserve">which is</w:t>
       </w:r>
       <w:r>
         <w:t xml:space="preserve"> </w:t>
@@ -3994,31 +4053,37 @@
         <w:t xml:space="preserve">asymmetric</w:t>
       </w:r>
       <w:r>
-        <w:t xml:space="preserve">: DeepMF and CBF are rating predictors, so their strongest signal is</w:t>
-      </w:r>
-      <w:r>
-        <w:t xml:space="preserve"> </w:t>
-      </w:r>
-      <w:r>
-        <w:t xml:space="preserve">their scalar output; they enter the fusion as (normalized) scalars rather than raw</w:t>
-      </w:r>
-      <w:r>
-        <w:t xml:space="preserve"> </w:t>
-      </w:r>
-      <w:r>
-        <w:t xml:space="preserve">latent features. The sentiment stream, by contrast, is kept as a rich representation,</w:t>
-      </w:r>
-      <w:r>
-        <w:t xml:space="preserve"> </w:t>
-      </w:r>
-      <w:r>
-        <w:t xml:space="preserve">because aspect-level polarity is exactly the fine-grained signal the fusion is meant</w:t>
-      </w:r>
-      <w:r>
-        <w:t xml:space="preserve"> </w:t>
-      </w:r>
-      <w:r>
-        <w:t xml:space="preserve">to exploit. Second, the open-vocabulary aspect set is summarized by a</w:t>
+        <w:t xml:space="preserve">. DeepMF and CBF are rating predictors, so their strongest signal</w:t>
+      </w:r>
+      <w:r>
+        <w:t xml:space="preserve"> </w:t>
+      </w:r>
+      <w:r>
+        <w:t xml:space="preserve">is their scalar output, and they enter the fusion as (normalized) scalars rather than raw</w:t>
+      </w:r>
+      <w:r>
+        <w:t xml:space="preserve"> </w:t>
+      </w:r>
+      <w:r>
+        <w:t xml:space="preserve">latent features. The sentiment stream, by contrast, is kept as a rich representation.</w:t>
+      </w:r>
+      <w:r>
+        <w:t xml:space="preserve"> </w:t>
+      </w:r>
+      <w:r>
+        <w:t xml:space="preserve">Aspect-level polarity is, after all, exactly the fine-grained signal the fusion is meant</w:t>
+      </w:r>
+      <w:r>
+        <w:t xml:space="preserve"> </w:t>
+      </w:r>
+      <w:r>
+        <w:t xml:space="preserve">to exploit. The second design choice concerns the open-vocabulary aspect set, which is</w:t>
+      </w:r>
+      <w:r>
+        <w:t xml:space="preserve"> </w:t>
+      </w:r>
+      <w:r>
+        <w:t xml:space="preserve">summarized by a</w:t>
       </w:r>
       <w:r>
         <w:t xml:space="preserve"> </w:t>
@@ -4044,13 +4109,13 @@
         <w:t xml:space="preserve"> </w:t>
       </w:r>
       <w:r>
-        <w:t xml:space="preserve">layer rather than by hand-designed statistics, preserving</w:t>
-      </w:r>
-      <w:r>
-        <w:t xml:space="preserve"> </w:t>
-      </w:r>
-      <w:r>
-        <w:t xml:space="preserve">the identity of individual aspects.</w:t>
+        <w:t xml:space="preserve">layer rather than by hand-designed</w:t>
+      </w:r>
+      <w:r>
+        <w:t xml:space="preserve"> </w:t>
+      </w:r>
+      <w:r>
+        <w:t xml:space="preserve">statistics. This preserves the identity of individual aspects.</w:t>
       </w:r>
     </w:p>
     <w:bookmarkEnd w:id="21"/>
@@ -5289,13 +5354,13 @@
         <w:t xml:space="preserve"> </w:t>
       </w:r>
       <w:r>
-        <w:t xml:space="preserve">columns without discarding information; averaging across aspects, in particular,</w:t>
-      </w:r>
-      <w:r>
-        <w:t xml:space="preserve"> </w:t>
-      </w:r>
-      <w:r>
-        <w:t xml:space="preserve">destroys the polarity contrast</w:t>
+        <w:t xml:space="preserve">columns without discarding information. Averaging across aspects, in particular, destroys</w:t>
+      </w:r>
+      <w:r>
+        <w:t xml:space="preserve"> </w:t>
+      </w:r>
+      <w:r>
+        <w:t xml:space="preserve">the polarity contrast</w:t>
       </w:r>
       <w:r>
         <w:t xml:space="preserve"> </w:t>
@@ -5311,7 +5376,7 @@
         <w:t xml:space="preserve"> </w:t>
       </w:r>
       <w:r>
-        <w:t xml:space="preserve">aspects — the same failure mode observed for</w:t>
+        <w:t xml:space="preserve">aspects. This is the same failure mode observed for</w:t>
       </w:r>
       <w:r>
         <w:t xml:space="preserve"> </w:t>
@@ -7219,13 +7284,13 @@
         <w:t xml:space="preserve"> </w:t>
       </w:r>
       <w:r>
-        <w:t xml:space="preserve">static fusion base. The base is the A2-IRM fusion — a non-negative matrix</w:t>
-      </w:r>
-      <w:r>
-        <w:t xml:space="preserve"> </w:t>
-      </w:r>
-      <w:r>
-        <w:t xml:space="preserve">factorization followed by a decision-tree regressor (NMF+DT) — computed</w:t>
+        <w:t xml:space="preserve">static fusion base. The base is the A2-IRM fusion, a non-negative matrix factorization</w:t>
+      </w:r>
+      <w:r>
+        <w:t xml:space="preserve"> </w:t>
+      </w:r>
+      <w:r>
+        <w:t xml:space="preserve">followed by a decision-tree regressor (NMF+DT). It is computed</w:t>
       </w:r>
       <w:r>
         <w:t xml:space="preserve"> </w:t>
@@ -7241,19 +7306,19 @@
         <w:t xml:space="preserve"> </w:t>
       </w:r>
       <w:r>
-        <w:t xml:space="preserve">from</w:t>
-      </w:r>
-      <w:r>
-        <w:t xml:space="preserve"> </w:t>
-      </w:r>
-      <w:r>
-        <w:t xml:space="preserve">the three signals A2-IRM already uses, namely the keyword-ABSA vector and the DeepMF</w:t>
-      </w:r>
-      <w:r>
-        <w:t xml:space="preserve"> </w:t>
-      </w:r>
-      <w:r>
-        <w:t xml:space="preserve">and CBF scalars:</w:t>
+        <w:t xml:space="preserve">from the three</w:t>
+      </w:r>
+      <w:r>
+        <w:t xml:space="preserve"> </w:t>
+      </w:r>
+      <w:r>
+        <w:t xml:space="preserve">signals A2-IRM already uses, namely the keyword-ABSA vector and the DeepMF and CBF</w:t>
+      </w:r>
+      <w:r>
+        <w:t xml:space="preserve"> </w:t>
+      </w:r>
+      <w:r>
+        <w:t xml:space="preserve">scalars:</w:t>
       </w:r>
     </w:p>
     <w:p>
@@ -7527,31 +7592,31 @@
         <w:t xml:space="preserve"> </w:t>
       </w:r>
       <w:r>
-        <w:t xml:space="preserve">from the base; it enters</w:t>
-      </w:r>
-      <w:r>
-        <w:t xml:space="preserve"> </w:t>
-      </w:r>
-      <w:r>
-        <w:t xml:space="preserve">only through the attention path. This makes the attribution unambiguous: any</w:t>
-      </w:r>
-      <w:r>
-        <w:t xml:space="preserve"> </w:t>
-      </w:r>
-      <w:r>
-        <w:t xml:space="preserve">improvement the residual achieves over A2-IRM is attributable to the new</w:t>
-      </w:r>
-      <w:r>
-        <w:t xml:space="preserve"> </w:t>
-      </w:r>
-      <w:r>
-        <w:t xml:space="preserve">(PyABSA + attention) information rather than to refitting the same features. The head</w:t>
-      </w:r>
-      <w:r>
-        <w:t xml:space="preserve"> </w:t>
-      </w:r>
-      <w:r>
-        <w:t xml:space="preserve">emits the correction and the final prediction is additive,</w:t>
+        <w:t xml:space="preserve">from the base. It enters</w:t>
+      </w:r>
+      <w:r>
+        <w:t xml:space="preserve"> </w:t>
+      </w:r>
+      <w:r>
+        <w:t xml:space="preserve">only through the attention path. This makes the attribution unambiguous: any improvement</w:t>
+      </w:r>
+      <w:r>
+        <w:t xml:space="preserve"> </w:t>
+      </w:r>
+      <w:r>
+        <w:t xml:space="preserve">the residual achieves over A2-IRM is attributable to the new (PyABSA + attention)</w:t>
+      </w:r>
+      <w:r>
+        <w:t xml:space="preserve"> </w:t>
+      </w:r>
+      <w:r>
+        <w:t xml:space="preserve">information rather than to refitting the same features. The head emits the correction,</w:t>
+      </w:r>
+      <w:r>
+        <w:t xml:space="preserve"> </w:t>
+      </w:r>
+      <w:r>
+        <w:t xml:space="preserve">and the final prediction is additive,</w:t>
       </w:r>
     </w:p>
     <w:p>
@@ -7789,7 +7854,7 @@
         <w:pStyle w:val="BodyText"/>
       </w:pPr>
       <w:r>
-        <w:t xml:space="preserve">To keep the base prediction on the training set out-of-sample — otherwise the base</w:t>
+        <w:t xml:space="preserve">The base prediction on the training set must be kept out-of-sample. Otherwise, the base</w:t>
       </w:r>
       <w:r>
         <w:t xml:space="preserve"> </w:t>
@@ -7801,25 +7866,25 @@
         <w:t xml:space="preserve"> </w:t>
       </w:r>
       <w:r>
-        <w:t xml:space="preserve">attention path to learn — the training-fold base is produced by 5-fold out-of-fold</w:t>
-      </w:r>
-      <w:r>
-        <w:t xml:space="preserve"> </w:t>
-      </w:r>
-      <w:r>
-        <w:t xml:space="preserve">(OOF) stacking: for each fold the NMF+DT is fit on the complementary folds and predicts</w:t>
-      </w:r>
-      <w:r>
-        <w:t xml:space="preserve"> </w:t>
-      </w:r>
-      <w:r>
-        <w:t xml:space="preserve">the held-out fold. Validation and test bases are produced by an NMF+DT fit on the full</w:t>
-      </w:r>
-      <w:r>
-        <w:t xml:space="preserve"> </w:t>
-      </w:r>
-      <w:r>
-        <w:t xml:space="preserve">training split, which is already out-of-sample for those splits.</w:t>
+        <w:t xml:space="preserve">attention path to learn. For this reason, the training-fold base is produced by 5-fold</w:t>
+      </w:r>
+      <w:r>
+        <w:t xml:space="preserve"> </w:t>
+      </w:r>
+      <w:r>
+        <w:t xml:space="preserve">out-of-fold (OOF) stacking: for each fold, the NMF+DT is fit on the complementary folds</w:t>
+      </w:r>
+      <w:r>
+        <w:t xml:space="preserve"> </w:t>
+      </w:r>
+      <w:r>
+        <w:t xml:space="preserve">and predicts the held-out fold. Validation and test bases are produced by an NMF+DT fit</w:t>
+      </w:r>
+      <w:r>
+        <w:t xml:space="preserve"> </w:t>
+      </w:r>
+      <w:r>
+        <w:t xml:space="preserve">on the full training split, which is already out-of-sample for those splits.</w:t>
       </w:r>
     </w:p>
     <w:bookmarkEnd w:id="24"/>
@@ -8437,7 +8502,7 @@
         <w:t xml:space="preserve"> </w:t>
       </w:r>
       <w:r>
-        <w:t xml:space="preserve">correction, and the aspect-pooling weights</w:t>
+        <w:t xml:space="preserve">correction, while the aspect-pooling weights</w:t>
       </w:r>
       <w:r>
         <w:t xml:space="preserve"> </w:t>
@@ -8520,31 +8585,37 @@
         <w:t xml:space="preserve"> </w:t>
       </w:r>
       <w:r>
-        <w:t xml:space="preserve">the fusion adds over the static base</w:t>
-      </w:r>
-      <w:r>
-        <w:t xml:space="preserve"> </w:t>
-      </w:r>
-      <w:r>
-        <w:t xml:space="preserve">rather than the entire prediction — a distinction we keep explicit in the analysis.</w:t>
-      </w:r>
-      <w:r>
-        <w:t xml:space="preserve"> </w:t>
-      </w:r>
-      <w:r>
-        <w:t xml:space="preserve">Section 6.5 tests whether the aspect attention is faithful (i.e., whether the</w:t>
-      </w:r>
-      <w:r>
-        <w:t xml:space="preserve"> </w:t>
-      </w:r>
-      <w:r>
-        <w:t xml:space="preserve">most-attended aspect actually drives the prediction) using a perturbation study, since</w:t>
-      </w:r>
-      <w:r>
-        <w:t xml:space="preserve"> </w:t>
-      </w:r>
-      <w:r>
-        <w:t xml:space="preserve">attention weights are not automatically faithful explanations (Jain &amp; Wallace, 2019; Wiegreffe &amp; Pinter, 2019).</w:t>
+        <w:t xml:space="preserve">the fusion adds over the static base rather</w:t>
+      </w:r>
+      <w:r>
+        <w:t xml:space="preserve"> </w:t>
+      </w:r>
+      <w:r>
+        <w:t xml:space="preserve">than the entire prediction. We keep this distinction explicit throughout the analysis.</w:t>
+      </w:r>
+      <w:r>
+        <w:t xml:space="preserve"> </w:t>
+      </w:r>
+      <w:r>
+        <w:t xml:space="preserve">Section 6.5 tests whether the aspect attention is faithful, that is, whether the</w:t>
+      </w:r>
+      <w:r>
+        <w:t xml:space="preserve"> </w:t>
+      </w:r>
+      <w:r>
+        <w:t xml:space="preserve">most-attended aspect actually drives the prediction, using a perturbation study. This</w:t>
+      </w:r>
+      <w:r>
+        <w:t xml:space="preserve"> </w:t>
+      </w:r>
+      <w:r>
+        <w:t xml:space="preserve">check matters because attention weights are not automatically faithful explanations</w:t>
+      </w:r>
+      <w:r>
+        <w:t xml:space="preserve"> </w:t>
+      </w:r>
+      <w:r>
+        <w:t xml:space="preserve">(Jain &amp; Wallace, 2019; Wiegreffe &amp; Pinter, 2019).</w:t>
       </w:r>
     </w:p>
     <w:p>
@@ -8601,7 +8672,7 @@
         <w:t xml:space="preserve"> </w:t>
       </w:r>
       <w:r>
-        <w:t xml:space="preserve">sparsity/aspect regimes:</w:t>
+        <w:t xml:space="preserve">sparsity/aspect regimes. These are</w:t>
       </w:r>
       <w:r>
         <w:t xml:space="preserve"> </w:t>
@@ -8617,13 +8688,13 @@
         <w:t xml:space="preserve"> </w:t>
       </w:r>
       <w:r>
-        <w:t xml:space="preserve">(from the Amazon Review Data; Ni et al.,</w:t>
-      </w:r>
-      <w:r>
-        <w:t xml:space="preserve"> </w:t>
-      </w:r>
-      <w:r>
-        <w:t xml:space="preserve">2019),</w:t>
+        <w:t xml:space="preserve">(from the Amazon Review Data; Ni</w:t>
+      </w:r>
+      <w:r>
+        <w:t xml:space="preserve"> </w:t>
+      </w:r>
+      <w:r>
+        <w:t xml:space="preserve">et al., 2019),</w:t>
       </w:r>
       <w:r>
         <w:t xml:space="preserve"> </w:t>
@@ -8655,61 +8726,55 @@
         <w:t xml:space="preserve"> </w:t>
       </w:r>
       <w:r>
-        <w:t xml:space="preserve">(the hotel</w:t>
-      </w:r>
-      <w:r>
-        <w:t xml:space="preserve"> </w:t>
-      </w:r>
-      <w:r>
-        <w:t xml:space="preserve">reviews of Wang et al., 2010). Each record contains a user, an item, a 1–5 star rating,</w:t>
-      </w:r>
-      <w:r>
-        <w:t xml:space="preserve"> </w:t>
-      </w:r>
-      <w:r>
-        <w:t xml:space="preserve">and a free-text review.</w:t>
-      </w:r>
-      <w:r>
-        <w:t xml:space="preserve"> </w:t>
-      </w:r>
-      <w:r>
-        <w:t xml:space="preserve">The three corpora were selected deliberately rather than for convenience: they place the</w:t>
-      </w:r>
-      <w:r>
-        <w:t xml:space="preserve"> </w:t>
-      </w:r>
-      <w:r>
-        <w:t xml:space="preserve">same rating-prediction task under three different levels of aspect availability, which is</w:t>
-      </w:r>
-      <w:r>
-        <w:t xml:space="preserve"> </w:t>
-      </w:r>
-      <w:r>
-        <w:t xml:space="preserve">the axis our analysis (Sections 6.4–6.5) turns on. Each corpus is reduced with 5-core</w:t>
-      </w:r>
-      <w:r>
-        <w:t xml:space="preserve"> </w:t>
-      </w:r>
-      <w:r>
-        <w:t xml:space="preserve">filtering — retaining only users and items with at least five interactions — a standard</w:t>
-      </w:r>
-      <w:r>
-        <w:t xml:space="preserve"> </w:t>
-      </w:r>
-      <w:r>
-        <w:t xml:space="preserve">preprocessing step for review-based recommendation (Abinaya &amp; Devi, 2021; Cai et al.,</w:t>
-      </w:r>
-      <w:r>
-        <w:t xml:space="preserve"> </w:t>
-      </w:r>
-      <w:r>
-        <w:t xml:space="preserve">2022). 5-core filtering bounds, but does not remove, cold-start effects: the user–item</w:t>
-      </w:r>
-      <w:r>
-        <w:t xml:space="preserve"> </w:t>
-      </w:r>
-      <w:r>
-        <w:t xml:space="preserve">matrices remain below 0.1% density, so the rating signal alone is thin.</w:t>
+        <w:t xml:space="preserve">(the hotel reviews of Wang et al., 2010). Each record contains a user, an item, a 1–5 star</w:t>
+      </w:r>
+      <w:r>
+        <w:t xml:space="preserve"> </w:t>
+      </w:r>
+      <w:r>
+        <w:t xml:space="preserve">rating, and a free-text review. The three corpora were selected deliberately rather than</w:t>
+      </w:r>
+      <w:r>
+        <w:t xml:space="preserve"> </w:t>
+      </w:r>
+      <w:r>
+        <w:t xml:space="preserve">for convenience. They place the same rating-prediction task under three different levels</w:t>
+      </w:r>
+      <w:r>
+        <w:t xml:space="preserve"> </w:t>
+      </w:r>
+      <w:r>
+        <w:t xml:space="preserve">of aspect availability, which is the axis our analysis (Sections 6.4–6.5) turns on. Each</w:t>
+      </w:r>
+      <w:r>
+        <w:t xml:space="preserve"> </w:t>
+      </w:r>
+      <w:r>
+        <w:t xml:space="preserve">corpus is reduced with 5-core filtering, retaining only users and items with at least five</w:t>
+      </w:r>
+      <w:r>
+        <w:t xml:space="preserve"> </w:t>
+      </w:r>
+      <w:r>
+        <w:t xml:space="preserve">interactions, a standard preprocessing step for review-based recommendation (Abinaya &amp;</w:t>
+      </w:r>
+      <w:r>
+        <w:t xml:space="preserve"> </w:t>
+      </w:r>
+      <w:r>
+        <w:t xml:space="preserve">Devi, 2021; Cai et al., 2022). This filtering bounds, but does not remove, cold-start</w:t>
+      </w:r>
+      <w:r>
+        <w:t xml:space="preserve"> </w:t>
+      </w:r>
+      <w:r>
+        <w:t xml:space="preserve">effects. The user–item matrices remain below 0.1% density, so the rating signal alone is</w:t>
+      </w:r>
+      <w:r>
+        <w:t xml:space="preserve"> </w:t>
+      </w:r>
+      <w:r>
+        <w:t xml:space="preserve">thin.</w:t>
       </w:r>
     </w:p>
     <w:p>
@@ -8729,7 +8794,7 @@
         <w:t xml:space="preserve"> </w:t>
       </w:r>
       <w:r>
-        <w:t xml:space="preserve">stars; consequently the standard deviation of test ratings is close to the RMSE a</w:t>
+        <w:t xml:space="preserve">stars. Consequently, the standard deviation of test ratings is close to the RMSE a</w:t>
       </w:r>
       <w:r>
         <w:t xml:space="preserve"> </w:t>
@@ -8753,19 +8818,19 @@
         <w:t xml:space="preserve"> </w:t>
       </w:r>
       <w:r>
-        <w:t xml:space="preserve">to this study: the fraction of reviews for which the fixed-taxonomy keyword encoder finds</w:t>
-      </w:r>
-      <w:r>
-        <w:t xml:space="preserve"> </w:t>
-      </w:r>
-      <w:r>
-        <w:t xml:space="preserve">at least one aspect — 45.1% (Amazon), 87.6% (Restaurant), 95.9% (Hotel) — and the</w:t>
-      </w:r>
-      <w:r>
-        <w:t xml:space="preserve"> </w:t>
-      </w:r>
-      <w:r>
-        <w:t xml:space="preserve">corresponding coverage of the open-vocabulary PyABSA encoder, which is higher on the</w:t>
+        <w:t xml:space="preserve">to this study, namely the fraction of reviews for which the fixed-taxonomy keyword encoder</w:t>
+      </w:r>
+      <w:r>
+        <w:t xml:space="preserve"> </w:t>
+      </w:r>
+      <w:r>
+        <w:t xml:space="preserve">finds at least one aspect (45.1% for Amazon, 87.6% for Restaurant, and 95.9% for Hotel) and</w:t>
+      </w:r>
+      <w:r>
+        <w:t xml:space="preserve"> </w:t>
+      </w:r>
+      <w:r>
+        <w:t xml:space="preserve">the corresponding coverage of the open-vocabulary PyABSA encoder, which is higher on the</w:t>
       </w:r>
       <w:r>
         <w:t xml:space="preserve"> </w:t>
@@ -8851,49 +8916,49 @@
         <w:t xml:space="preserve"> </w:t>
       </w:r>
       <w:r>
-        <w:t xml:space="preserve">Comparability is enforced structurally rather than by convention: the split is generated</w:t>
-      </w:r>
-      <w:r>
-        <w:t xml:space="preserve"> </w:t>
-      </w:r>
-      <w:r>
-        <w:t xml:space="preserve">once and every training script — from the classical baselines to A2-FusionRS — loads the</w:t>
-      </w:r>
-      <w:r>
-        <w:t xml:space="preserve"> </w:t>
-      </w:r>
-      <w:r>
-        <w:t xml:space="preserve">same files instead of resampling, so all models are scored on exactly the same held-out</w:t>
-      </w:r>
-      <w:r>
-        <w:t xml:space="preserve"> </w:t>
-      </w:r>
-      <w:r>
-        <w:t xml:space="preserve">interactions and their per-interaction errors are directly pairable for significance</w:t>
-      </w:r>
-      <w:r>
-        <w:t xml:space="preserve"> </w:t>
-      </w:r>
-      <w:r>
-        <w:t xml:space="preserve">testing (Section 5.4). Ranking metrics use a per-user candidate set restricted to the</w:t>
-      </w:r>
-      <w:r>
-        <w:t xml:space="preserve"> </w:t>
-      </w:r>
-      <w:r>
-        <w:t xml:space="preserve">items that appear for that user in the test set, a common simplification that keeps the</w:t>
-      </w:r>
-      <w:r>
-        <w:t xml:space="preserve"> </w:t>
-      </w:r>
-      <w:r>
-        <w:t xml:space="preserve">ranking evaluation tractable and identical across models; we note it explicitly because it</w:t>
-      </w:r>
-      <w:r>
-        <w:t xml:space="preserve"> </w:t>
-      </w:r>
-      <w:r>
-        <w:t xml:space="preserve">makes the reported ranking figures comparative rather than absolute.</w:t>
+        <w:t xml:space="preserve">Comparability is enforced structurally rather than by convention. The split is generated</w:t>
+      </w:r>
+      <w:r>
+        <w:t xml:space="preserve"> </w:t>
+      </w:r>
+      <w:r>
+        <w:t xml:space="preserve">once, and every training script, from the classical baselines to A2-FusionRS, loads the</w:t>
+      </w:r>
+      <w:r>
+        <w:t xml:space="preserve"> </w:t>
+      </w:r>
+      <w:r>
+        <w:t xml:space="preserve">same files instead of resampling. All models are therefore scored on exactly the same</w:t>
+      </w:r>
+      <w:r>
+        <w:t xml:space="preserve"> </w:t>
+      </w:r>
+      <w:r>
+        <w:t xml:space="preserve">held-out interactions, and their per-interaction errors are directly pairable for</w:t>
+      </w:r>
+      <w:r>
+        <w:t xml:space="preserve"> </w:t>
+      </w:r>
+      <w:r>
+        <w:t xml:space="preserve">significance testing (Section 5.4). Ranking metrics use a per-user candidate set</w:t>
+      </w:r>
+      <w:r>
+        <w:t xml:space="preserve"> </w:t>
+      </w:r>
+      <w:r>
+        <w:t xml:space="preserve">restricted to the items that appear for that user in the test set, a common simplification</w:t>
+      </w:r>
+      <w:r>
+        <w:t xml:space="preserve"> </w:t>
+      </w:r>
+      <w:r>
+        <w:t xml:space="preserve">that keeps the ranking evaluation tractable and identical across models. We note this</w:t>
+      </w:r>
+      <w:r>
+        <w:t xml:space="preserve"> </w:t>
+      </w:r>
+      <w:r>
+        <w:t xml:space="preserve">explicitly because it makes the reported ranking figures comparative rather than absolute.</w:t>
       </w:r>
     </w:p>
     <w:p>
@@ -8901,13 +8966,13 @@
         <w:pStyle w:val="BodyText"/>
       </w:pPr>
       <w:r>
-        <w:t xml:space="preserve">Single-seed differences on this data are of the same order as the run-to-run variance of an</w:t>
-      </w:r>
-      <w:r>
-        <w:t xml:space="preserve"> </w:t>
-      </w:r>
-      <w:r>
-        <w:t xml:space="preserve">identically configured model, so a one-off comparison is not, by itself, trustworthy.</w:t>
+        <w:t xml:space="preserve">Single-seed differences on this data are of the same order as the run-to-run variance of</w:t>
+      </w:r>
+      <w:r>
+        <w:t xml:space="preserve"> </w:t>
+      </w:r>
+      <w:r>
+        <w:t xml:space="preserve">an identically configured model, so a one-off comparison is not, by itself, trustworthy.</w:t>
       </w:r>
       <w:r>
         <w:t xml:space="preserve"> </w:t>
@@ -8919,7 +8984,7 @@
         <w:t xml:space="preserve"> </w:t>
       </w:r>
       <w:r>
-        <w:t xml:space="preserve">1011}), and we report the mean and standard deviation across them; all headline claims are</w:t>
+        <w:t xml:space="preserve">1011}), and we report the mean and standard deviation across them. All headline claims are</w:t>
       </w:r>
       <w:r>
         <w:t xml:space="preserve"> </w:t>
@@ -9113,19 +9178,19 @@
         <w:t xml:space="preserve"> </w:t>
       </w:r>
       <w:r>
-        <w:t xml:space="preserve">prediction; we adapt them faithfully to explicit-rating regression — mean-squared-error</w:t>
-      </w:r>
-      <w:r>
-        <w:t xml:space="preserve"> </w:t>
-      </w:r>
-      <w:r>
-        <w:t xml:space="preserve">training with a sigmoid on the normalized rating scale and the same</w:t>
-      </w:r>
-      <w:r>
-        <w:t xml:space="preserve"> </w:t>
-      </w:r>
-      <w:r>
-        <w:t xml:space="preserve">best-validation-checkpoint policy used elsewhere — so that they are directly comparable</w:t>
+        <w:t xml:space="preserve">prediction. We adapt them faithfully to explicit-rating regression, using</w:t>
+      </w:r>
+      <w:r>
+        <w:t xml:space="preserve"> </w:t>
+      </w:r>
+      <w:r>
+        <w:t xml:space="preserve">mean-squared-error training with a sigmoid on the normalized rating scale and the same</w:t>
+      </w:r>
+      <w:r>
+        <w:t xml:space="preserve"> </w:t>
+      </w:r>
+      <w:r>
+        <w:t xml:space="preserve">best-validation-checkpoint policy used elsewhere, so that they are directly comparable</w:t>
       </w:r>
       <w:r>
         <w:t xml:space="preserve"> </w:t>
@@ -9228,7 +9293,7 @@
         <w:t xml:space="preserve"> </w:t>
       </w:r>
       <w:r>
-        <w:t xml:space="preserve">add the review channel; the contrast across tiers therefore isolates the value of reviews</w:t>
+        <w:t xml:space="preserve">add the review channel. The contrast across tiers therefore isolates the value of reviews</w:t>
       </w:r>
       <w:r>
         <w:t xml:space="preserve"> </w:t>
@@ -9252,7 +9317,7 @@
         <w:pStyle w:val="FirstParagraph"/>
       </w:pPr>
       <w:r>
-        <w:t xml:space="preserve">The primary metrics are RMSE and MAE on the original 1–5 scale; we additionally report</w:t>
+        <w:t xml:space="preserve">The primary metrics are RMSE and MAE on the original 1–5 scale. We additionally report</w:t>
       </w:r>
       <w:r>
         <w:t xml:space="preserve"> </w:t>
@@ -9308,7 +9373,7 @@
         <w:t xml:space="preserve"> </w:t>
       </w:r>
       <w:r>
-        <w:t xml:space="preserve">alongside the test outcome: with test sets of</w:t>
+        <w:t xml:space="preserve">alongside the test outcome. With test sets of</w:t>
       </w:r>
       <w:r>
         <w:t xml:space="preserve"> </w:t>
@@ -9360,13 +9425,13 @@
         <w:t xml:space="preserve"> </w:t>
       </w:r>
       <w:r>
-        <w:t xml:space="preserve">difference is negligible, so significance is never interpreted in isolation from effect</w:t>
-      </w:r>
-      <w:r>
-        <w:t xml:space="preserve"> </w:t>
-      </w:r>
-      <w:r>
-        <w:t xml:space="preserve">size.</w:t>
+        <w:t xml:space="preserve">difference is negligible. Significance is therefore never interpreted in isolation from</w:t>
+      </w:r>
+      <w:r>
+        <w:t xml:space="preserve"> </w:t>
+      </w:r>
+      <w:r>
+        <w:t xml:space="preserve">effect size.</w:t>
       </w:r>
     </w:p>
     <w:bookmarkEnd w:id="31"/>
@@ -9580,7 +9645,7 @@
         <w:t xml:space="preserve"> </w:t>
       </w:r>
       <w:r>
-        <w:t xml:space="preserve">achieves the lowest error in all three domains — 0.6418 (Amazon), 0.6665 (Restaurant),</w:t>
+        <w:t xml:space="preserve">achieves the lowest error in all three domains, at 0.6418 (Amazon), 0.6665 (Restaurant),</w:t>
       </w:r>
       <w:r>
         <w:t xml:space="preserve"> </w:t>
@@ -9592,7 +9657,7 @@
         <w:t xml:space="preserve"> </w:t>
       </w:r>
       <w:r>
-        <w:t xml:space="preserve">1.5%, 1.9%, and 1.5%; against the best neural collaborative baseline (NeuMF) it is a</w:t>
+        <w:t xml:space="preserve">1.5%, 1.9%, and 1.5%. Against the best neural collaborative baseline (NeuMF), it is a</w:t>
       </w:r>
       <w:r>
         <w:t xml:space="preserve"> </w:t>
@@ -9639,13 +9704,13 @@
         <w:t xml:space="preserve"> </w:t>
       </w:r>
       <w:r>
-        <w:t xml:space="preserve">thus both large against rating-only methods and consistent — not the product of a</w:t>
-      </w:r>
-      <w:r>
-        <w:t xml:space="preserve"> </w:t>
-      </w:r>
-      <w:r>
-        <w:t xml:space="preserve">favorable seed. MAE tells the same story and is reported alongside RMSE in Table 4:</w:t>
+        <w:t xml:space="preserve">thus both large against rating-only methods and consistent, not the product of a</w:t>
+      </w:r>
+      <w:r>
+        <w:t xml:space="preserve"> </w:t>
+      </w:r>
+      <w:r>
+        <w:t xml:space="preserve">favorable seed. MAE tells the same story and is reported alongside RMSE in Table 4.</w:t>
       </w:r>
       <w:r>
         <w:t xml:space="preserve"> </w:t>
@@ -9669,13 +9734,19 @@
         <w:t xml:space="preserve"> </w:t>
       </w:r>
       <w:r>
-        <w:t xml:space="preserve">protocol of Section 5.2 — all models score within a narrow band — so they do not</w:t>
-      </w:r>
-      <w:r>
-        <w:t xml:space="preserve"> </w:t>
-      </w:r>
-      <w:r>
-        <w:t xml:space="preserve">discriminate between methods, and we treat RMSE and MAE as the informative metrics.</w:t>
+        <w:t xml:space="preserve">protocol of Section 5.2, with all models scoring within a narrow band, so they do not</w:t>
+      </w:r>
+      <w:r>
+        <w:t xml:space="preserve"> </w:t>
+      </w:r>
+      <w:r>
+        <w:t xml:space="preserve">discriminate between methods. We therefore treat RMSE and MAE as the informative</w:t>
+      </w:r>
+      <w:r>
+        <w:t xml:space="preserve"> </w:t>
+      </w:r>
+      <w:r>
+        <w:t xml:space="preserve">metrics.</w:t>
       </w:r>
     </w:p>
     <w:p>
@@ -10929,61 +11000,55 @@
         <w:t xml:space="preserve"> </w:t>
       </w:r>
       <w:r>
-        <w:t xml:space="preserve">barely below — and for Item-KNN equal to — the Global Mean predictor (1.2143 / 1.1516 /</w:t>
-      </w:r>
-      <w:r>
-        <w:t xml:space="preserve"> </w:t>
-      </w:r>
-      <w:r>
-        <w:t xml:space="preserve">0.9163). This reference</w:t>
-      </w:r>
-      <w:r>
-        <w:t xml:space="preserve"> </w:t>
-      </w:r>
-      <w:r>
-        <w:t xml:space="preserve">point is not arbitrary: the RMSE of the constant mean predictor equals the standard</w:t>
-      </w:r>
-      <w:r>
-        <w:t xml:space="preserve"> </w:t>
-      </w:r>
-      <w:r>
-        <w:t xml:space="preserve">deviation of the test ratings (an algebraic identity), so a model that matches it has</w:t>
-      </w:r>
-      <w:r>
-        <w:t xml:space="preserve"> </w:t>
-      </w:r>
-      <w:r>
-        <w:t xml:space="preserve">learned nothing beyond the average rating. On Hotel, Item-KNN’s RMSE (0.9163) coincides</w:t>
-      </w:r>
-      <w:r>
-        <w:t xml:space="preserve"> </w:t>
-      </w:r>
-      <w:r>
-        <w:t xml:space="preserve">with the Global Mean to four decimals, showing that under extreme sparsity the</w:t>
-      </w:r>
-      <w:r>
-        <w:t xml:space="preserve"> </w:t>
-      </w:r>
-      <w:r>
-        <w:t xml:space="preserve">neighborhood model falls back to the mean for essentially every prediction; the trained</w:t>
-      </w:r>
-      <w:r>
-        <w:t xml:space="preserve"> </w:t>
-      </w:r>
-      <w:r>
-        <w:t xml:space="preserve">factorization models (SVD, NeuMF, DeepFM) improve on the mean only marginally, by roughly</w:t>
-      </w:r>
-      <w:r>
-        <w:t xml:space="preserve"> </w:t>
-      </w:r>
-      <w:r>
-        <w:t xml:space="preserve">2–8%. That four independent collaborative methods converge at this level is strong</w:t>
-      </w:r>
-      <w:r>
-        <w:t xml:space="preserve"> </w:t>
-      </w:r>
-      <w:r>
-        <w:t xml:space="preserve">evidence that</w:t>
+        <w:t xml:space="preserve">barely below the Global Mean predictor (1.2143 / 1.1516 / 0.9163), and for Item-KNN equal</w:t>
+      </w:r>
+      <w:r>
+        <w:t xml:space="preserve"> </w:t>
+      </w:r>
+      <w:r>
+        <w:t xml:space="preserve">to it. This reference point is not arbitrary. The RMSE of the constant mean predictor</w:t>
+      </w:r>
+      <w:r>
+        <w:t xml:space="preserve"> </w:t>
+      </w:r>
+      <w:r>
+        <w:t xml:space="preserve">equals the standard deviation of the test ratings (an algebraic identity), so a model that</w:t>
+      </w:r>
+      <w:r>
+        <w:t xml:space="preserve"> </w:t>
+      </w:r>
+      <w:r>
+        <w:t xml:space="preserve">matches it has learned nothing beyond the average rating. On Hotel, Item-KNN’s RMSE</w:t>
+      </w:r>
+      <w:r>
+        <w:t xml:space="preserve"> </w:t>
+      </w:r>
+      <w:r>
+        <w:t xml:space="preserve">(0.9163) coincides with the Global Mean to four decimals, showing that under extreme</w:t>
+      </w:r>
+      <w:r>
+        <w:t xml:space="preserve"> </w:t>
+      </w:r>
+      <w:r>
+        <w:t xml:space="preserve">sparsity the neighborhood model falls back to the mean for essentially every prediction.</w:t>
+      </w:r>
+      <w:r>
+        <w:t xml:space="preserve"> </w:t>
+      </w:r>
+      <w:r>
+        <w:t xml:space="preserve">The trained factorization models (SVD, NeuMF, DeepFM) improve on the mean only marginally,</w:t>
+      </w:r>
+      <w:r>
+        <w:t xml:space="preserve"> </w:t>
+      </w:r>
+      <w:r>
+        <w:t xml:space="preserve">by roughly 2–8%. That four independent collaborative methods converge at this level is</w:t>
+      </w:r>
+      <w:r>
+        <w:t xml:space="preserve"> </w:t>
+      </w:r>
+      <w:r>
+        <w:t xml:space="preserve">strong evidence that</w:t>
       </w:r>
       <w:r>
         <w:t xml:space="preserve"> </w:t>
@@ -11003,13 +11068,13 @@
         <w:t xml:space="preserve"> </w:t>
       </w:r>
       <w:r>
-        <w:t xml:space="preserve">is the genuine ceiling of rating-only CF on review data this</w:t>
-      </w:r>
-      <w:r>
-        <w:t xml:space="preserve"> </w:t>
-      </w:r>
-      <w:r>
-        <w:t xml:space="preserve">sparse, rather than an artifact of under-tuning (Idrissi &amp; Zellou, 2020; Yuan &amp;</w:t>
+        <w:t xml:space="preserve">is the genuine ceiling of rating-only CF on review data</w:t>
+      </w:r>
+      <w:r>
+        <w:t xml:space="preserve"> </w:t>
+      </w:r>
+      <w:r>
+        <w:t xml:space="preserve">this sparse, rather than an artifact of under-tuning (Idrissi &amp; Zellou, 2020; Yuan &amp;</w:t>
       </w:r>
       <w:r>
         <w:t xml:space="preserve"> </w:t>
@@ -11021,7 +11086,7 @@
         <w:t xml:space="preserve"> </w:t>
       </w:r>
       <w:r>
-        <w:t xml:space="preserve">signals — which move the error from</w:t>
+        <w:t xml:space="preserve">signals are doing the decisive work: they move the error from</w:t>
       </w:r>
       <w:r>
         <w:t xml:space="preserve"> </w:t>
@@ -11058,19 +11123,13 @@
         </m:r>
       </m:oMath>
       <w:r>
-        <w:t xml:space="preserve">, a 31–47%</w:t>
-      </w:r>
-      <w:r>
-        <w:t xml:space="preserve"> </w:t>
-      </w:r>
-      <w:r>
-        <w:t xml:space="preserve">reduction — are doing the decisive work, and the remainder of this section attributes</w:t>
-      </w:r>
-      <w:r>
-        <w:t xml:space="preserve"> </w:t>
-      </w:r>
-      <w:r>
-        <w:t xml:space="preserve">that work to its source (Cai et al., 2022; Elahi et al., 2023).</w:t>
+        <w:t xml:space="preserve">, a 31–47% reduction. The remainder of this section attributes that work</w:t>
+      </w:r>
+      <w:r>
+        <w:t xml:space="preserve"> </w:t>
+      </w:r>
+      <w:r>
+        <w:t xml:space="preserve">to its source (Cai et al., 2022; Elahi et al., 2023).</w:t>
       </w:r>
     </w:p>
     <w:bookmarkEnd w:id="34"/>
@@ -11088,19 +11147,19 @@
         <w:pStyle w:val="FirstParagraph"/>
       </w:pPr>
       <w:r>
-        <w:t xml:space="preserve">Table 6 decomposes the contribution of each component, and the decomposition is</w:t>
-      </w:r>
-      <w:r>
-        <w:t xml:space="preserve"> </w:t>
-      </w:r>
-      <w:r>
-        <w:t xml:space="preserve">unusually clean because the two candidate explanations — the attention architecture and</w:t>
-      </w:r>
-      <w:r>
-        <w:t xml:space="preserve"> </w:t>
-      </w:r>
-      <w:r>
-        <w:t xml:space="preserve">the model-based aspect signal — can be toggled independently.</w:t>
+        <w:t xml:space="preserve">Table 6 decomposes the contribution of each component. The decomposition is unusually</w:t>
+      </w:r>
+      <w:r>
+        <w:t xml:space="preserve"> </w:t>
+      </w:r>
+      <w:r>
+        <w:t xml:space="preserve">clean here because its two candidate explanations (the attention architecture and the</w:t>
+      </w:r>
+      <w:r>
+        <w:t xml:space="preserve"> </w:t>
+      </w:r>
+      <w:r>
+        <w:t xml:space="preserve">model-based aspect signal) can be toggled independently.</w:t>
       </w:r>
     </w:p>
     <w:p>
@@ -11484,7 +11543,7 @@
         <w:t xml:space="preserve"> </w:t>
       </w:r>
       <w:r>
-        <w:t xml:space="preserve">0.6791 / 0.6291. The per-domain gaps are +0.0003, −0.0018, and −0.0005 — all within a</w:t>
+        <w:t xml:space="preserve">0.6791 / 0.6291. The per-domain gaps are +0.0003, −0.0018, and −0.0005, all within a</w:t>
       </w:r>
       <w:r>
         <w:t xml:space="preserve"> </w:t>
@@ -11496,7 +11555,7 @@
         <w:t xml:space="preserve"> </w:t>
       </w:r>
       <w:r>
-        <w:t xml:space="preserve">pairing significance with effect size: on Amazon and Hotel the Wilcoxon test flags these</w:t>
+        <w:t xml:space="preserve">pairing significance with effect size. On Amazon and Hotel, the Wilcoxon test flags these</w:t>
       </w:r>
       <w:r>
         <w:t xml:space="preserve"> </w:t>
@@ -11508,7 +11567,7 @@
         <w:t xml:space="preserve"> </w:t>
       </w:r>
       <w:r>
-        <w:t xml:space="preserve">purposes, identical — a direct consequence of testing</w:t>
+        <w:t xml:space="preserve">purposes, identical. This is a direct consequence of testing</w:t>
       </w:r>
       <w:r>
         <w:t xml:space="preserve"> </w:t>
@@ -11531,13 +11590,13 @@
         <w:t xml:space="preserve"> </w:t>
       </w:r>
       <w:r>
-        <w:t xml:space="preserve">paired errors, and a warning</w:t>
-      </w:r>
-      <w:r>
-        <w:t xml:space="preserve"> </w:t>
-      </w:r>
-      <w:r>
-        <w:t xml:space="preserve">against reading such</w:t>
+        <w:t xml:space="preserve">paired errors, and it</w:t>
+      </w:r>
+      <w:r>
+        <w:t xml:space="preserve"> </w:t>
+      </w:r>
+      <w:r>
+        <w:t xml:space="preserve">is a warning against reading such</w:t>
       </w:r>
       <w:r>
         <w:t xml:space="preserve"> </w:t>
@@ -11548,19 +11607,19 @@
         </m:r>
       </m:oMath>
       <w:r>
-        <w:t xml:space="preserve">-values as evidence of a real improvement. Read through the effect</w:t>
-      </w:r>
-      <w:r>
-        <w:t xml:space="preserve"> </w:t>
-      </w:r>
-      <w:r>
-        <w:t xml:space="preserve">size, the honest conclusion is that the attention architecture, given no new information,</w:t>
-      </w:r>
-      <w:r>
-        <w:t xml:space="preserve"> </w:t>
-      </w:r>
-      <w:r>
-        <w:t xml:space="preserve">sits at the same ceiling as the static fuser.</w:t>
+        <w:t xml:space="preserve">-values as evidence of a real improvement. Read</w:t>
+      </w:r>
+      <w:r>
+        <w:t xml:space="preserve"> </w:t>
+      </w:r>
+      <w:r>
+        <w:t xml:space="preserve">through the effect size, the honest conclusion is that the attention architecture, given</w:t>
+      </w:r>
+      <w:r>
+        <w:t xml:space="preserve"> </w:t>
+      </w:r>
+      <w:r>
+        <w:t xml:space="preserve">no new information, sits at the same ceiling as the static fuser.</w:t>
       </w:r>
     </w:p>
     <w:p>
@@ -11605,7 +11664,7 @@
         <w:t xml:space="preserve"> </w:t>
       </w:r>
       <w:r>
-        <w:t xml:space="preserve">five seeds, by 0.0133 / 0.0115 / 0.0090 — an effect roughly an order of magnitude larger</w:t>
+        <w:t xml:space="preserve">five seeds, by 0.0133 / 0.0115 / 0.0090, an effect roughly an order of magnitude larger</w:t>
       </w:r>
       <w:r>
         <w:t xml:space="preserve"> </w:t>
@@ -11623,13 +11682,13 @@
         <w:t xml:space="preserve"> </w:t>
       </w:r>
       <w:r>
-        <w:t xml:space="preserve">as a central finding precisely because it is falsifiable and was, in fact, a negative</w:t>
-      </w:r>
-      <w:r>
-        <w:t xml:space="preserve"> </w:t>
-      </w:r>
-      <w:r>
-        <w:t xml:space="preserve">result for our original hypothesis that the fusion architecture would be the driver;</w:t>
+        <w:t xml:space="preserve">as a central finding precisely because it is falsifiable. It was, in fact, a negative</w:t>
+      </w:r>
+      <w:r>
+        <w:t xml:space="preserve"> </w:t>
+      </w:r>
+      <w:r>
+        <w:t xml:space="preserve">result for our original hypothesis that the fusion architecture would be the driver, and</w:t>
       </w:r>
       <w:r>
         <w:t xml:space="preserve"> </w:t>
@@ -11693,7 +11752,7 @@
         <w:t xml:space="preserve"> </w:t>
       </w:r>
       <w:r>
-        <w:t xml:space="preserve">attention is behind on Amazon (+0.0034 RMSE), marginally ahead on Restaurant (−0.0011) and</w:t>
+        <w:t xml:space="preserve">attention is behind on Amazon (+0.0034 RMSE), marginally ahead on Restaurant (−0.0011), and</w:t>
       </w:r>
       <w:r>
         <w:t xml:space="preserve"> </w:t>
@@ -11705,13 +11764,13 @@
         <w:t xml:space="preserve"> </w:t>
       </w:r>
       <w:r>
-        <w:t xml:space="preserve">rounding: attention-gated fusion is ahead of the static control in 1 of 5 seeds on Amazon,</w:t>
-      </w:r>
-      <w:r>
-        <w:t xml:space="preserve"> </w:t>
-      </w:r>
-      <w:r>
-        <w:t xml:space="preserve">4 of 5 on Restaurant, and 3 of 5 on Hotel — 8 of 15 domain–seed cells in total, a near</w:t>
+        <w:t xml:space="preserve">rounding. Attention-gated fusion is ahead of the static control in 1 of 5 seeds on Amazon,</w:t>
+      </w:r>
+      <w:r>
+        <w:t xml:space="preserve"> </w:t>
+      </w:r>
+      <w:r>
+        <w:t xml:space="preserve">4 of 5 on Restaurant, and 3 of 5 on Hotel, or 8 of 15 domain–seed cells in total, close to a</w:t>
       </w:r>
       <w:r>
         <w:t xml:space="preserve"> </w:t>
@@ -11759,13 +11818,13 @@
         <w:t xml:space="preserve"> </w:t>
       </w:r>
       <w:r>
-        <w:t xml:space="preserve">tuples, whereas the static control only becomes competitive once it is given the nine</w:t>
-      </w:r>
-      <w:r>
-        <w:t xml:space="preserve"> </w:t>
-      </w:r>
-      <w:r>
-        <w:t xml:space="preserve">hand-engineered order-statistics we designed to summarize those same aspects; parity</w:t>
+        <w:t xml:space="preserve">tuples. The static control, by contrast, only becomes competitive once it is given the nine</w:t>
+      </w:r>
+      <w:r>
+        <w:t xml:space="preserve"> </w:t>
+      </w:r>
+      <w:r>
+        <w:t xml:space="preserve">hand-engineered order-statistics we designed to summarize those same aspects. Parity</w:t>
       </w:r>
       <w:r>
         <w:t xml:space="preserve"> </w:t>
@@ -11783,7 +11842,7 @@
         <w:t xml:space="preserve"> </w:t>
       </w:r>
       <w:r>
-        <w:t xml:space="preserve">that the tree does not, and — unlike a decorative heatmap — these attributions survive a</w:t>
+        <w:t xml:space="preserve">that the tree does not. Unlike a decorative heatmap, these attributions survive a</w:t>
       </w:r>
       <w:r>
         <w:t xml:space="preserve"> </w:t>
@@ -11801,19 +11860,13 @@
         <w:t xml:space="preserve"> </w:t>
       </w:r>
       <w:r>
-        <w:t xml:space="preserve">treats interpretability as a first-class design goal rather than a by-product</w:t>
-      </w:r>
-      <w:r>
-        <w:t xml:space="preserve"> </w:t>
-      </w:r>
-      <w:r>
-        <w:t xml:space="preserve">(Wu et al., 2024; Kim et al., 2024), and not as a fusion operator that supersedes the</w:t>
-      </w:r>
-      <w:r>
-        <w:t xml:space="preserve"> </w:t>
-      </w:r>
-      <w:r>
-        <w:t xml:space="preserve">static baseline.</w:t>
+        <w:t xml:space="preserve">treats interpretability as a first-class design goal rather than a by-product (Wu et al.,</w:t>
+      </w:r>
+      <w:r>
+        <w:t xml:space="preserve"> </w:t>
+      </w:r>
+      <w:r>
+        <w:t xml:space="preserve">2024; Kim et al., 2024), and not as a fusion operator that supersedes the static baseline.</w:t>
       </w:r>
     </w:p>
     <w:bookmarkEnd w:id="36"/>
@@ -11861,7 +11914,7 @@
         <w:t xml:space="preserve"> </w:t>
       </w:r>
       <w:r>
-        <w:t xml:space="preserve">fewest reviews — exactly where a complementary aspect signal has the most room to add</w:t>
+        <w:t xml:space="preserve">fewest reviews, exactly where a complementary aspect signal has the most room to add</w:t>
       </w:r>
       <w:r>
         <w:t xml:space="preserve"> </w:t>
@@ -11873,31 +11926,37 @@
         <w:t xml:space="preserve"> </w:t>
       </w:r>
       <w:r>
-        <w:t xml:space="preserve">three domains this is a directional trend rather than a law, and we frame it as such; but</w:t>
-      </w:r>
-      <w:r>
-        <w:t xml:space="preserve"> </w:t>
-      </w:r>
-      <w:r>
-        <w:t xml:space="preserve">it is a mechanistically sensible one, and it yields actionable guidance: model-based ABSA</w:t>
-      </w:r>
-      <w:r>
-        <w:t xml:space="preserve"> </w:t>
-      </w:r>
-      <w:r>
-        <w:t xml:space="preserve">is most worth its added cost in domains whose aspect vocabulary is sparse or poorly served</w:t>
-      </w:r>
-      <w:r>
-        <w:t xml:space="preserve"> </w:t>
-      </w:r>
-      <w:r>
-        <w:t xml:space="preserve">by a fixed taxonomy, and least worth it where a lightweight keyword encoder already</w:t>
-      </w:r>
-      <w:r>
-        <w:t xml:space="preserve"> </w:t>
-      </w:r>
-      <w:r>
-        <w:t xml:space="preserve">saturates coverage. This complements the broader evidence that fine-grained aspect signals</w:t>
+        <w:t xml:space="preserve">only three domains, this is a directional trend rather than a law, and we frame it as</w:t>
+      </w:r>
+      <w:r>
+        <w:t xml:space="preserve"> </w:t>
+      </w:r>
+      <w:r>
+        <w:t xml:space="preserve">such. It is nonetheless a mechanistically sensible one, and it yields actionable guidance.</w:t>
+      </w:r>
+      <w:r>
+        <w:t xml:space="preserve"> </w:t>
+      </w:r>
+      <w:r>
+        <w:t xml:space="preserve">Model-based ABSA is most worth its added cost in domains whose aspect vocabulary is</w:t>
+      </w:r>
+      <w:r>
+        <w:t xml:space="preserve"> </w:t>
+      </w:r>
+      <w:r>
+        <w:t xml:space="preserve">sparse or poorly served by a fixed taxonomy, and least worth it where a lightweight</w:t>
+      </w:r>
+      <w:r>
+        <w:t xml:space="preserve"> </w:t>
+      </w:r>
+      <w:r>
+        <w:t xml:space="preserve">keyword encoder already saturates coverage. This complements the broader evidence that</w:t>
+      </w:r>
+      <w:r>
+        <w:t xml:space="preserve"> </w:t>
+      </w:r>
+      <w:r>
+        <w:t xml:space="preserve">fine-grained aspect signals</w:t>
       </w:r>
       <w:r>
         <w:t xml:space="preserve"> </w:t>
@@ -11927,13 +11986,13 @@
         <w:pStyle w:val="FirstParagraph"/>
       </w:pPr>
       <w:r>
-        <w:t xml:space="preserve">A2-FusionRS exposes two attributions, which we analyze and — importantly — validate</w:t>
-      </w:r>
-      <w:r>
-        <w:t xml:space="preserve"> </w:t>
-      </w:r>
-      <w:r>
-        <w:t xml:space="preserve">rather than merely display.</w:t>
+        <w:t xml:space="preserve">A2-FusionRS exposes two attributions. Importantly, we analyze and validate both rather</w:t>
+      </w:r>
+      <w:r>
+        <w:t xml:space="preserve"> </w:t>
+      </w:r>
+      <w:r>
+        <w:t xml:space="preserve">than merely display them.</w:t>
       </w:r>
     </w:p>
     <w:p>
@@ -11957,13 +12016,13 @@
         <w:t xml:space="preserve"> </w:t>
       </w:r>
       <w:r>
-        <w:t xml:space="preserve">weight on the four modalities (each near the 0.25 uniform baseline), with domain-specific</w:t>
-      </w:r>
-      <w:r>
-        <w:t xml:space="preserve"> </w:t>
-      </w:r>
-      <w:r>
-        <w:t xml:space="preserve">tilts (Table 7, Fig. 4b): the aspect modality receives its</w:t>
+        <w:t xml:space="preserve">weight on the four modalities, each near the 0.25 uniform baseline, with domain-specific</w:t>
+      </w:r>
+      <w:r>
+        <w:t xml:space="preserve"> </w:t>
+      </w:r>
+      <w:r>
+        <w:t xml:space="preserve">tilts (Table 7, Fig. 4b). The aspect modality receives its</w:t>
       </w:r>
       <w:r>
         <w:t xml:space="preserve"> </w:t>
@@ -11979,25 +12038,31 @@
         <w:t xml:space="preserve"> </w:t>
       </w:r>
       <w:r>
-        <w:t xml:space="preserve">weight in the highest-coverage</w:t>
-      </w:r>
-      <w:r>
-        <w:t xml:space="preserve"> </w:t>
-      </w:r>
-      <w:r>
-        <w:t xml:space="preserve">domain (Hotel, 0.211) and higher weight in the lower-coverage domains (Amazon 0.279,</w:t>
-      </w:r>
-      <w:r>
-        <w:t xml:space="preserve"> </w:t>
-      </w:r>
-      <w:r>
-        <w:t xml:space="preserve">Restaurant 0.290), while content features dominate on Hotel (0.302). The correlation</w:t>
-      </w:r>
-      <w:r>
-        <w:t xml:space="preserve"> </w:t>
-      </w:r>
-      <w:r>
-        <w:t xml:space="preserve">between keyword coverage and the aspect-modality gate weight is negative (</w:t>
+        <w:t xml:space="preserve">weight in the</w:t>
+      </w:r>
+      <w:r>
+        <w:t xml:space="preserve"> </w:t>
+      </w:r>
+      <w:r>
+        <w:t xml:space="preserve">highest-coverage domain (Hotel, 0.211) and higher weight in the lower-coverage domains</w:t>
+      </w:r>
+      <w:r>
+        <w:t xml:space="preserve"> </w:t>
+      </w:r>
+      <w:r>
+        <w:t xml:space="preserve">(Amazon 0.279, Restaurant 0.290), while content features dominate on Hotel (0.302). The</w:t>
+      </w:r>
+      <w:r>
+        <w:t xml:space="preserve"> </w:t>
+      </w:r>
+      <w:r>
+        <w:t xml:space="preserve">correlation between keyword coverage and the aspect-modality gate weight is negative</w:t>
+      </w:r>
+      <w:r>
+        <w:t xml:space="preserve"> </w:t>
+      </w:r>
+      <w:r>
+        <w:t xml:space="preserve">(</w:t>
       </w:r>
       <m:oMath>
         <m:r>
@@ -12036,19 +12101,25 @@
         <w:t xml:space="preserve"> </w:t>
       </w:r>
       <w:r>
-        <w:t xml:space="preserve">corroboration of the accuracy finding in Section 6.4: the model learns to</w:t>
-      </w:r>
-      <w:r>
-        <w:t xml:space="preserve"> </w:t>
-      </w:r>
-      <w:r>
-        <w:t xml:space="preserve">lean on the model-based aspect signal precisely where keyword-ABSA is weak. With only</w:t>
-      </w:r>
-      <w:r>
-        <w:t xml:space="preserve"> </w:t>
-      </w:r>
-      <w:r>
-        <w:t xml:space="preserve">three domains this is indicative rather than conclusive, and we present it as such.</w:t>
+        <w:t xml:space="preserve">corroboration of the accuracy finding in Section</w:t>
+      </w:r>
+      <w:r>
+        <w:t xml:space="preserve"> </w:t>
+      </w:r>
+      <w:r>
+        <w:t xml:space="preserve">6.4: the model learns to lean on the model-based aspect signal precisely where</w:t>
+      </w:r>
+      <w:r>
+        <w:t xml:space="preserve"> </w:t>
+      </w:r>
+      <w:r>
+        <w:t xml:space="preserve">keyword-ABSA is weak. With only three domains, this finding is indicative rather than</w:t>
+      </w:r>
+      <w:r>
+        <w:t xml:space="preserve"> </w:t>
+      </w:r>
+      <w:r>
+        <w:t xml:space="preserve">conclusive, and we present it as such.</w:t>
       </w:r>
     </w:p>
     <w:p>
@@ -12364,7 +12435,7 @@
         <w:t xml:space="preserve"> </w:t>
       </w:r>
       <w:r>
-        <w:t xml:space="preserve">aspects of a review the model attends to; representative cases are shown in Table 9. To</w:t>
+        <w:t xml:space="preserve">aspects of a review the model attends to. Representative cases are shown in Table 9. To</w:t>
       </w:r>
       <w:r>
         <w:t xml:space="preserve"> </w:t>
@@ -12383,28 +12454,25 @@
         <w:t xml:space="preserve">faithful</w:t>
       </w:r>
       <w:r>
-        <w:t xml:space="preserve"> </w:t>
-      </w:r>
-      <w:r>
-        <w:t xml:space="preserve">— whether the most-attended aspect actually</w:t>
-      </w:r>
-      <w:r>
-        <w:t xml:space="preserve"> </w:t>
-      </w:r>
-      <w:r>
-        <w:t xml:space="preserve">drives the prediction — we run a perturbation study: for each test review with at least</w:t>
-      </w:r>
-      <w:r>
-        <w:t xml:space="preserve"> </w:t>
-      </w:r>
-      <w:r>
-        <w:t xml:space="preserve">two aspects, we remove the top-attended aspect and, separately, a randomly chosen aspect,</w:t>
-      </w:r>
-      <w:r>
-        <w:t xml:space="preserve"> </w:t>
-      </w:r>
-      <w:r>
-        <w:t xml:space="preserve">and measure the change in prediction. Removing the top-attended aspect changes the</w:t>
+        <w:t xml:space="preserve">, that is, whether the most-attended aspect</w:t>
+      </w:r>
+      <w:r>
+        <w:t xml:space="preserve"> </w:t>
+      </w:r>
+      <w:r>
+        <w:t xml:space="preserve">actually drives the prediction, we run a perturbation study: for each test review with at</w:t>
+      </w:r>
+      <w:r>
+        <w:t xml:space="preserve"> </w:t>
+      </w:r>
+      <w:r>
+        <w:t xml:space="preserve">least two aspects, we remove the top-attended aspect and, separately, a randomly chosen</w:t>
+      </w:r>
+      <w:r>
+        <w:t xml:space="preserve"> </w:t>
+      </w:r>
+      <w:r>
+        <w:t xml:space="preserve">aspect, and measure the change in prediction. Removing the top-attended aspect changes the</w:t>
       </w:r>
       <w:r>
         <w:t xml:space="preserve"> </w:t>
@@ -12416,13 +12484,13 @@
         <w:t xml:space="preserve"> </w:t>
       </w:r>
       <w:r>
-        <w:t xml:space="preserve">Amazon, 0.060 vs. 0.032 on Restaurant, 0.047 vs. 0.021 on Hotel; Table 8, Fig. 4a), and the</w:t>
-      </w:r>
-      <w:r>
-        <w:t xml:space="preserve"> </w:t>
-      </w:r>
-      <w:r>
-        <w:t xml:space="preserve">top-attended aspect has the larger effect in roughly 70% of reviews (</w:t>
+        <w:t xml:space="preserve">Amazon, 0.060 vs. 0.032 on Restaurant, 0.047 vs. 0.021 on Hotel; Table 8, Fig. 4a). The</w:t>
+      </w:r>
+      <w:r>
+        <w:t xml:space="preserve"> </w:t>
+      </w:r>
+      <w:r>
+        <w:t xml:space="preserve">top-attended aspect also has the larger effect in roughly 70% of reviews (</w:t>
       </w:r>
       <m:oMath>
         <m:r>
@@ -12442,31 +12510,25 @@
         <w:t xml:space="preserve"> </w:t>
       </w:r>
       <w:r>
-        <w:t xml:space="preserve">in all</w:t>
-      </w:r>
-      <w:r>
-        <w:t xml:space="preserve"> </w:t>
-      </w:r>
-      <w:r>
-        <w:t xml:space="preserve">domains).</w:t>
-      </w:r>
-      <w:r>
-        <w:t xml:space="preserve"> </w:t>
-      </w:r>
-      <w:r>
-        <w:t xml:space="preserve">The attention is thus faithful in the aggregate — a stronger claim than an attention</w:t>
-      </w:r>
-      <w:r>
-        <w:t xml:space="preserve"> </w:t>
-      </w:r>
-      <w:r>
-        <w:t xml:space="preserve">heatmap alone would justify (Jain &amp; Wallace, 2019; Wiegreffe &amp; Pinter, 2019) — though</w:t>
-      </w:r>
-      <w:r>
-        <w:t xml:space="preserve"> </w:t>
-      </w:r>
-      <w:r>
-        <w:t xml:space="preserve">we note it is faithful to the residual</w:t>
+        <w:t xml:space="preserve">in</w:t>
+      </w:r>
+      <w:r>
+        <w:t xml:space="preserve"> </w:t>
+      </w:r>
+      <w:r>
+        <w:t xml:space="preserve">all domains). The attention is thus faithful in the aggregate, a stronger claim than an</w:t>
+      </w:r>
+      <w:r>
+        <w:t xml:space="preserve"> </w:t>
+      </w:r>
+      <w:r>
+        <w:t xml:space="preserve">attention heatmap alone would justify (Jain &amp; Wallace, 2019; Wiegreffe &amp; Pinter, 2019). We</w:t>
+      </w:r>
+      <w:r>
+        <w:t xml:space="preserve"> </w:t>
+      </w:r>
+      <w:r>
+        <w:t xml:space="preserve">note, however, that it is faithful to the residual</w:t>
       </w:r>
       <w:r>
         <w:t xml:space="preserve"> </w:t>
@@ -12482,19 +12544,19 @@
         <w:t xml:space="preserve"> </w:t>
       </w:r>
       <w:r>
-        <w:t xml:space="preserve">the fusion adds over the static base,</w:t>
-      </w:r>
-      <w:r>
-        <w:t xml:space="preserve"> </w:t>
-      </w:r>
-      <w:r>
-        <w:t xml:space="preserve">not to the entire prediction, and that the illustrative cases are not uniformly clean</w:t>
-      </w:r>
-      <w:r>
-        <w:t xml:space="preserve"> </w:t>
-      </w:r>
-      <w:r>
-        <w:t xml:space="preserve">(the perturbation agreement is ~70%, not 100%).</w:t>
+        <w:t xml:space="preserve">the fusion adds over the</w:t>
+      </w:r>
+      <w:r>
+        <w:t xml:space="preserve"> </w:t>
+      </w:r>
+      <w:r>
+        <w:t xml:space="preserve">static base, not to the entire prediction, and that the illustrative cases are not</w:t>
+      </w:r>
+      <w:r>
+        <w:t xml:space="preserve"> </w:t>
+      </w:r>
+      <w:r>
+        <w:t xml:space="preserve">uniformly clean (the perturbation agreement is ~70%, not 100%).</w:t>
       </w:r>
     </w:p>
     <w:p>
@@ -13393,19 +13455,19 @@
         <w:t xml:space="preserve"> </w:t>
       </w:r>
       <w:r>
-        <w:t xml:space="preserve">readings matter, and they point in the same direction only if stated carefully. First,</w:t>
-      </w:r>
-      <w:r>
-        <w:t xml:space="preserve"> </w:t>
-      </w:r>
-      <w:r>
-        <w:t xml:space="preserve">inference latency — the one directly comparable figure, since it is the wall-clock cost of</w:t>
-      </w:r>
-      <w:r>
-        <w:t xml:space="preserve"> </w:t>
-      </w:r>
-      <w:r>
-        <w:t xml:space="preserve">scoring the same test set — is</w:t>
+        <w:t xml:space="preserve">readings matter here, and they point in the same direction only if stated carefully.</w:t>
+      </w:r>
+      <w:r>
+        <w:t xml:space="preserve"> </w:t>
+      </w:r>
+      <w:r>
+        <w:t xml:space="preserve">First, inference latency is the one directly comparable figure, since it is the</w:t>
+      </w:r>
+      <w:r>
+        <w:t xml:space="preserve"> </w:t>
+      </w:r>
+      <w:r>
+        <w:t xml:space="preserve">wall-clock cost of scoring the same test set. It is</w:t>
       </w:r>
       <w:r>
         <w:t xml:space="preserve"> </w:t>
@@ -13421,37 +13483,43 @@
         <w:t xml:space="preserve"> </w:t>
       </w:r>
       <w:r>
-        <w:t xml:space="preserve">for A2-FusionRS (11–15 ms) versus 23–122 ms for</w:t>
-      </w:r>
-      <w:r>
-        <w:t xml:space="preserve"> </w:t>
-      </w:r>
-      <w:r>
-        <w:t xml:space="preserve">the neural baselines and up to 392 ms for Item-KNN. At serving time the model looks up</w:t>
-      </w:r>
-      <w:r>
-        <w:t xml:space="preserve"> </w:t>
-      </w:r>
-      <w:r>
-        <w:t xml:space="preserve">pre-computed modality features and runs only a compact fusion head, so it is fast.</w:t>
-      </w:r>
-      <w:r>
-        <w:t xml:space="preserve"> </w:t>
-      </w:r>
-      <w:r>
-        <w:t xml:space="preserve">Second, the fusion head carries just ≈ 63k trainable parameters, one to two orders of</w:t>
-      </w:r>
-      <w:r>
-        <w:t xml:space="preserve"> </w:t>
-      </w:r>
-      <w:r>
-        <w:t xml:space="preserve">magnitude fewer than the baselines’ 0.7–3.1 M, because the collaborative baselines must</w:t>
-      </w:r>
-      <w:r>
-        <w:t xml:space="preserve"> </w:t>
-      </w:r>
-      <w:r>
-        <w:t xml:space="preserve">store full user/item embedding tables whereas A2-FusionRS learns only the fusion.</w:t>
+        <w:t xml:space="preserve">for A2-FusionRS (11–15 ms)</w:t>
+      </w:r>
+      <w:r>
+        <w:t xml:space="preserve"> </w:t>
+      </w:r>
+      <w:r>
+        <w:t xml:space="preserve">versus 23–122 ms for the neural baselines and up to 392 ms for Item-KNN. At serving time,</w:t>
+      </w:r>
+      <w:r>
+        <w:t xml:space="preserve"> </w:t>
+      </w:r>
+      <w:r>
+        <w:t xml:space="preserve">the model looks up pre-computed modality features and runs only a compact fusion head, so</w:t>
+      </w:r>
+      <w:r>
+        <w:t xml:space="preserve"> </w:t>
+      </w:r>
+      <w:r>
+        <w:t xml:space="preserve">it is fast. Second, the fusion head carries just ≈ 63k trainable parameters, one to two</w:t>
+      </w:r>
+      <w:r>
+        <w:t xml:space="preserve"> </w:t>
+      </w:r>
+      <w:r>
+        <w:t xml:space="preserve">orders of magnitude fewer than the baselines’ 0.7–3.1 M. This is because the collaborative</w:t>
+      </w:r>
+      <w:r>
+        <w:t xml:space="preserve"> </w:t>
+      </w:r>
+      <w:r>
+        <w:t xml:space="preserve">baselines must store full user/item embedding tables, whereas A2-FusionRS learns only the</w:t>
+      </w:r>
+      <w:r>
+        <w:t xml:space="preserve"> </w:t>
+      </w:r>
+      <w:r>
+        <w:t xml:space="preserve">fusion.</w:t>
       </w:r>
     </w:p>
     <w:p>
@@ -13942,7 +14010,7 @@
         <w:t xml:space="preserve"> </w:t>
       </w:r>
       <w:r>
-        <w:t xml:space="preserve">trainable cost:</w:t>
+        <w:t xml:space="preserve">trainable cost.</w:t>
       </w:r>
       <w:r>
         <w:t xml:space="preserve"> </w:t>
@@ -13960,31 +14028,31 @@
         <w:t xml:space="preserve"> </w:t>
       </w:r>
       <w:r>
-        <w:t xml:space="preserve">training time (26–41 s for the head) is comparable to the neural baselines’ but likewise</w:t>
-      </w:r>
-      <w:r>
-        <w:t xml:space="preserve"> </w:t>
-      </w:r>
-      <w:r>
-        <w:t xml:space="preserve">excludes that upstream cost. The honest summary is that A2-FusionRS shifts effort to an</w:t>
-      </w:r>
-      <w:r>
-        <w:t xml:space="preserve"> </w:t>
-      </w:r>
-      <w:r>
-        <w:t xml:space="preserve">offline precomputation stage and, in return, serves recommendations with low online</w:t>
-      </w:r>
-      <w:r>
-        <w:t xml:space="preserve"> </w:t>
-      </w:r>
-      <w:r>
-        <w:t xml:space="preserve">latency and a small trainable footprint — an appropriate profile for a deployed recommender</w:t>
-      </w:r>
-      <w:r>
-        <w:t xml:space="preserve"> </w:t>
-      </w:r>
-      <w:r>
-        <w:t xml:space="preserve">but not a claim of lower total cost.</w:t>
+        <w:t xml:space="preserve">training time (26–41 s for the head) is comparable to the neural baselines’, but it</w:t>
+      </w:r>
+      <w:r>
+        <w:t xml:space="preserve"> </w:t>
+      </w:r>
+      <w:r>
+        <w:t xml:space="preserve">likewise excludes that upstream cost. The honest summary is that A2-FusionRS shifts effort</w:t>
+      </w:r>
+      <w:r>
+        <w:t xml:space="preserve"> </w:t>
+      </w:r>
+      <w:r>
+        <w:t xml:space="preserve">to an offline precomputation stage and, in return, serves recommendations with low online</w:t>
+      </w:r>
+      <w:r>
+        <w:t xml:space="preserve"> </w:t>
+      </w:r>
+      <w:r>
+        <w:t xml:space="preserve">latency and a small trainable footprint. This is an appropriate profile for a deployed</w:t>
+      </w:r>
+      <w:r>
+        <w:t xml:space="preserve"> </w:t>
+      </w:r>
+      <w:r>
+        <w:t xml:space="preserve">recommender, but not a claim of lower total cost.</w:t>
       </w:r>
     </w:p>
     <w:bookmarkEnd w:id="39"/>
@@ -14008,7 +14076,7 @@
         <w:t xml:space="preserve"> </w:t>
       </w:r>
       <w:r>
-        <w:t xml:space="preserve">English-language domains and a single PyABSA checkpoint; generalization to other</w:t>
+        <w:t xml:space="preserve">English-language domains and a single PyABSA checkpoint. Generalization to other</w:t>
       </w:r>
       <w:r>
         <w:t xml:space="preserve"> </w:t>
@@ -14020,7 +14088,7 @@
         <w:t xml:space="preserve"> </w:t>
       </w:r>
       <w:r>
-        <w:t xml:space="preserve">not improve accuracy over static fusion given the same features; our contribution is the</w:t>
+        <w:t xml:space="preserve">not improve accuracy over static fusion given the same features. Our contribution is the</w:t>
       </w:r>
       <w:r>
         <w:t xml:space="preserve"> </w:t>
@@ -14067,7 +14135,7 @@
         <w:t xml:space="preserve"> </w:t>
       </w:r>
       <w:r>
-        <w:t xml:space="preserve">interpretability attributions describe the residual refinement over the static base, and</w:t>
+        <w:t xml:space="preserve">interpretability attributions describe the residual refinement over the static base. The</w:t>
       </w:r>
       <w:r>
         <w:t xml:space="preserve"> </w:t>
@@ -14105,31 +14173,31 @@
         <w:pStyle w:val="FirstParagraph"/>
       </w:pPr>
       <w:r>
-        <w:t xml:space="preserve">We presented A2-FusionRS, an attention-gated fusion recommender that adds open-vocabulary,</w:t>
-      </w:r>
-      <w:r>
-        <w:t xml:space="preserve"> </w:t>
-      </w:r>
-      <w:r>
-        <w:t xml:space="preserve">model-based per-aspect sentiment to a static-fusion hybrid through a learned</w:t>
-      </w:r>
-      <w:r>
-        <w:t xml:space="preserve"> </w:t>
-      </w:r>
-      <w:r>
-        <w:t xml:space="preserve">aspect-sequence pooling layer, and that predicts a residual correction over that hybrid.</w:t>
-      </w:r>
-      <w:r>
-        <w:t xml:space="preserve"> </w:t>
-      </w:r>
-      <w:r>
-        <w:t xml:space="preserve">On the three research questions, the evidence is clear and, where it is limiting, stated</w:t>
-      </w:r>
-      <w:r>
-        <w:t xml:space="preserve"> </w:t>
-      </w:r>
-      <w:r>
-        <w:t xml:space="preserve">plainly.</w:t>
+        <w:t xml:space="preserve">We presented A2-FusionRS, an attention-gated fusion recommender that adds</w:t>
+      </w:r>
+      <w:r>
+        <w:t xml:space="preserve"> </w:t>
+      </w:r>
+      <w:r>
+        <w:t xml:space="preserve">open-vocabulary, model-based per-aspect sentiment to a static-fusion hybrid through a</w:t>
+      </w:r>
+      <w:r>
+        <w:t xml:space="preserve"> </w:t>
+      </w:r>
+      <w:r>
+        <w:t xml:space="preserve">learned aspect-sequence pooling layer, and that predicts a residual correction over that</w:t>
+      </w:r>
+      <w:r>
+        <w:t xml:space="preserve"> </w:t>
+      </w:r>
+      <w:r>
+        <w:t xml:space="preserve">hybrid. On the three research questions, the evidence is clear and, where it is limiting,</w:t>
+      </w:r>
+      <w:r>
+        <w:t xml:space="preserve"> </w:t>
+      </w:r>
+      <w:r>
+        <w:t xml:space="preserve">stated plainly.</w:t>
       </w:r>
       <w:r>
         <w:t xml:space="preserve"> </w:t>
@@ -14142,19 +14210,19 @@
         <w:t xml:space="preserve">RQ1</w:t>
       </w:r>
       <w:r>
-        <w:t xml:space="preserve">: A2-FusionRS attains the lowest RMSE in all three domains and improves</w:t>
-      </w:r>
-      <w:r>
-        <w:t xml:space="preserve"> </w:t>
-      </w:r>
-      <w:r>
-        <w:t xml:space="preserve">significantly over classical, neural, and hybrid baselines at every seed — decisively</w:t>
-      </w:r>
-      <w:r>
-        <w:t xml:space="preserve"> </w:t>
-      </w:r>
-      <w:r>
-        <w:t xml:space="preserve">against rating-only methods and consistently against the strong A2-IRM hybrid.</w:t>
+        <w:t xml:space="preserve">: A2-FusionRS attains the lowest RMSE in all three domains and</w:t>
+      </w:r>
+      <w:r>
+        <w:t xml:space="preserve"> </w:t>
+      </w:r>
+      <w:r>
+        <w:t xml:space="preserve">improves significantly over classical, neural, and hybrid baselines at every seed,</w:t>
+      </w:r>
+      <w:r>
+        <w:t xml:space="preserve"> </w:t>
+      </w:r>
+      <w:r>
+        <w:t xml:space="preserve">decisively against rating-only methods and consistently against the strong A2-IRM hybrid.</w:t>
       </w:r>
       <w:r>
         <w:t xml:space="preserve"> </w:t>
@@ -14167,31 +14235,25 @@
         <w:t xml:space="preserve">RQ2</w:t>
       </w:r>
       <w:r>
-        <w:t xml:space="preserve">:</w:t>
-      </w:r>
-      <w:r>
-        <w:t xml:space="preserve"> </w:t>
-      </w:r>
-      <w:r>
-        <w:t xml:space="preserve">the improvement is attributable to the model-based aspect modality, not to the attention</w:t>
-      </w:r>
-      <w:r>
-        <w:t xml:space="preserve"> </w:t>
-      </w:r>
-      <w:r>
-        <w:t xml:space="preserve">mechanism; a static tree given the same aspect features is equally strong, so we credit</w:t>
-      </w:r>
-      <w:r>
-        <w:t xml:space="preserve"> </w:t>
-      </w:r>
-      <w:r>
-        <w:t xml:space="preserve">the signal rather than the architecture and refrain from claiming an accuracy advantage</w:t>
-      </w:r>
-      <w:r>
-        <w:t xml:space="preserve"> </w:t>
-      </w:r>
-      <w:r>
-        <w:t xml:space="preserve">for attention.</w:t>
+        <w:t xml:space="preserve">: the improvement is attributable to the model-based aspect modality, not to</w:t>
+      </w:r>
+      <w:r>
+        <w:t xml:space="preserve"> </w:t>
+      </w:r>
+      <w:r>
+        <w:t xml:space="preserve">the attention mechanism. A static tree given the same aspect features is equally strong,</w:t>
+      </w:r>
+      <w:r>
+        <w:t xml:space="preserve"> </w:t>
+      </w:r>
+      <w:r>
+        <w:t xml:space="preserve">so we credit the signal rather than the architecture and refrain from claiming an</w:t>
+      </w:r>
+      <w:r>
+        <w:t xml:space="preserve"> </w:t>
+      </w:r>
+      <w:r>
+        <w:t xml:space="preserve">accuracy advantage for attention.</w:t>
       </w:r>
       <w:r>
         <w:t xml:space="preserve"> </w:t>
@@ -14204,25 +14266,25 @@
         <w:t xml:space="preserve">RQ3</w:t>
       </w:r>
       <w:r>
-        <w:t xml:space="preserve">: the value of model-based ABSA grows as a domain’s keyword-aspect</w:t>
-      </w:r>
-      <w:r>
-        <w:t xml:space="preserve"> </w:t>
-      </w:r>
-      <w:r>
-        <w:t xml:space="preserve">coverage falls, which tells practitioners when the costlier encoder is worth adopting.</w:t>
-      </w:r>
-      <w:r>
-        <w:t xml:space="preserve"> </w:t>
-      </w:r>
-      <w:r>
-        <w:t xml:space="preserve">Beyond accuracy, the fusion is interpretable, and its aspect attention is faithful under a</w:t>
-      </w:r>
-      <w:r>
-        <w:t xml:space="preserve"> </w:t>
-      </w:r>
-      <w:r>
-        <w:t xml:space="preserve">perturbation test rather than merely displayed.</w:t>
+        <w:t xml:space="preserve">: the value of model-based ABSA grows as a</w:t>
+      </w:r>
+      <w:r>
+        <w:t xml:space="preserve"> </w:t>
+      </w:r>
+      <w:r>
+        <w:t xml:space="preserve">domain’s keyword-aspect coverage falls, which tells practitioners when the costlier</w:t>
+      </w:r>
+      <w:r>
+        <w:t xml:space="preserve"> </w:t>
+      </w:r>
+      <w:r>
+        <w:t xml:space="preserve">encoder is worth adopting. Beyond accuracy, the fusion is interpretable, and its aspect</w:t>
+      </w:r>
+      <w:r>
+        <w:t xml:space="preserve"> </w:t>
+      </w:r>
+      <w:r>
+        <w:t xml:space="preserve">attention is faithful under a perturbation test rather than merely displayed.</w:t>
       </w:r>
     </w:p>
     <w:p>
@@ -14236,7 +14298,7 @@
         <w:t xml:space="preserve"> </w:t>
       </w:r>
       <w:r>
-        <w:t xml:space="preserve">methodological: by toggling architecture and signal independently, the attribution</w:t>
+        <w:t xml:space="preserve">methodological. By toggling architecture and signal independently, the attribution</w:t>
       </w:r>
       <w:r>
         <w:t xml:space="preserve"> </w:t>
@@ -14270,13 +14332,13 @@
         <w:t xml:space="preserve"> </w:t>
       </w:r>
       <w:r>
-        <w:t xml:space="preserve">change mattered — a discipline the field applies too rarely. The second is the</w:t>
-      </w:r>
-      <w:r>
-        <w:t xml:space="preserve"> </w:t>
-      </w:r>
-      <w:r>
-        <w:t xml:space="preserve">honesty of the negative result: reporting that the attention mechanism only matches the</w:t>
+        <w:t xml:space="preserve">change mattered, a discipline the field applies too rarely. The second is the</w:t>
+      </w:r>
+      <w:r>
+        <w:t xml:space="preserve"> </w:t>
+      </w:r>
+      <w:r>
+        <w:t xml:space="preserve">honesty of the negative result. Reporting that the attention mechanism only matches the</w:t>
       </w:r>
       <w:r>
         <w:t xml:space="preserve"> </w:t>
@@ -14296,37 +14358,37 @@
         <w:t xml:space="preserve"> </w:t>
       </w:r>
       <w:r>
-        <w:t xml:space="preserve">English-language domains and a single PyABSA checkpoint — in particular to mid-coverage</w:t>
-      </w:r>
-      <w:r>
-        <w:t xml:space="preserve"> </w:t>
-      </w:r>
-      <w:r>
-        <w:t xml:space="preserve">domains that would test the coverage-dependence trend, and to other languages and</w:t>
-      </w:r>
-      <w:r>
-        <w:t xml:space="preserve"> </w:t>
-      </w:r>
-      <w:r>
-        <w:t xml:space="preserve">aspect extractors. The aspect-sequence pooling is deliberately simple; richer pooling</w:t>
-      </w:r>
-      <w:r>
-        <w:t xml:space="preserve"> </w:t>
-      </w:r>
-      <w:r>
-        <w:t xml:space="preserve">(e.g., multi-query or hierarchical attention over aspects) may extract more from the same</w:t>
-      </w:r>
-      <w:r>
-        <w:t xml:space="preserve"> </w:t>
-      </w:r>
-      <w:r>
-        <w:t xml:space="preserve">signal, and would be a fair test of whether an attention advantage can be recovered where</w:t>
-      </w:r>
-      <w:r>
-        <w:t xml:space="preserve"> </w:t>
-      </w:r>
-      <w:r>
-        <w:t xml:space="preserve">we found none. Stronger review-aware baselines (graph- and LLM-based aspect models;</w:t>
+        <w:t xml:space="preserve">English-language domains and a single PyABSA checkpoint, in particular to mid-coverage</w:t>
+      </w:r>
+      <w:r>
+        <w:t xml:space="preserve"> </w:t>
+      </w:r>
+      <w:r>
+        <w:t xml:space="preserve">domains that would test the coverage-dependence trend, and to other languages and aspect</w:t>
+      </w:r>
+      <w:r>
+        <w:t xml:space="preserve"> </w:t>
+      </w:r>
+      <w:r>
+        <w:t xml:space="preserve">extractors. The aspect-sequence pooling is deliberately simple. Richer pooling (e.g.,</w:t>
+      </w:r>
+      <w:r>
+        <w:t xml:space="preserve"> </w:t>
+      </w:r>
+      <w:r>
+        <w:t xml:space="preserve">multi-query or hierarchical attention over aspects) may extract more from the same</w:t>
+      </w:r>
+      <w:r>
+        <w:t xml:space="preserve"> </w:t>
+      </w:r>
+      <w:r>
+        <w:t xml:space="preserve">signal, and it would be a fair test of whether an attention advantage can be recovered</w:t>
+      </w:r>
+      <w:r>
+        <w:t xml:space="preserve"> </w:t>
+      </w:r>
+      <w:r>
+        <w:t xml:space="preserve">where we found none. Stronger review-aware baselines (graph- and LLM-based aspect models;</w:t>
       </w:r>
       <w:r>
         <w:t xml:space="preserve"> </w:t>
@@ -14373,19 +14435,19 @@
           <w:b/>
           <w:bCs/>
         </w:rPr>
-        <w:t xml:space="preserve">[AUTHOR ACTION REQUIRED before submission]</w:t>
-      </w:r>
-      <w:r>
-        <w:t xml:space="preserve"> </w:t>
-      </w:r>
-      <w:r>
-        <w:t xml:space="preserve">The four statements below are Elsevier /</w:t>
-      </w:r>
-      <w:r>
-        <w:t xml:space="preserve"> </w:t>
-      </w:r>
-      <w:r>
-        <w:t xml:space="preserve">ESWA submission requirements. Placeholders are marked</w:t>
+        <w:t xml:space="preserve">[AUTHOR ACTION REMAINING before submission]</w:t>
+      </w:r>
+      <w:r>
+        <w:t xml:space="preserve"> </w:t>
+      </w:r>
+      <w:r>
+        <w:t xml:space="preserve">Author name(s)/affiliation and the</w:t>
+      </w:r>
+      <w:r>
+        <w:t xml:space="preserve"> </w:t>
+      </w:r>
+      <w:r>
+        <w:t xml:space="preserve">repository URL are still placeholders</w:t>
       </w:r>
       <w:r>
         <w:t xml:space="preserve"> </w:t>
@@ -14397,16 +14459,13 @@
         <w:t xml:space="preserve">[[ ]]</w:t>
       </w:r>
       <w:r>
-        <w:t xml:space="preserve"> </w:t>
-      </w:r>
-      <w:r>
-        <w:t xml:space="preserve">and must be completed with</w:t>
-      </w:r>
-      <w:r>
-        <w:t xml:space="preserve"> </w:t>
-      </w:r>
-      <w:r>
-        <w:t xml:space="preserve">author-verified information — none of this content should be inferred or fabricated.</w:t>
+        <w:t xml:space="preserve">; everything else below is filled with</w:t>
+      </w:r>
+      <w:r>
+        <w:t xml:space="preserve"> </w:t>
+      </w:r>
+      <w:r>
+        <w:t xml:space="preserve">author-confirmed information (2026-07).</w:t>
       </w:r>
     </w:p>
     <w:p>
@@ -14484,62 +14543,19 @@
         <w:t xml:space="preserve"> </w:t>
       </w:r>
       <w:r>
+        <w:t xml:space="preserve">This work was supported by the Desentralisasi–Matching Fund research scheme</w:t>
+      </w:r>
+      <w:r>
+        <w:t xml:space="preserve"> </w:t>
+      </w:r>
+      <w:r>
         <w:rPr>
           <w:rStyle w:val="VerbatimChar"/>
         </w:rPr>
-        <w:t xml:space="preserve">[[This work was supported by &lt;funding body / scheme name&gt;, grant number &lt;grant number&gt;.]]</w:t>
-      </w:r>
-      <w:r>
-        <w:t xml:space="preserve"> </w:t>
-      </w:r>
-      <w:r>
-        <w:rPr>
-          <w:i/>
-          <w:iCs/>
-        </w:rPr>
-        <w:t xml:space="preserve">(If this study was produced under the Universitas Merdeka Malang</w:t>
-      </w:r>
-      <w:r>
-        <w:rPr>
-          <w:i/>
-          <w:iCs/>
-        </w:rPr>
-        <w:t xml:space="preserve"> </w:t>
-      </w:r>
-      <w:r>
-        <w:rPr>
-          <w:i/>
-          <w:iCs/>
-        </w:rPr>
-        <w:t xml:space="preserve">2026 internal research scheme mentioned in project records, insert the exact scheme name</w:t>
-      </w:r>
-      <w:r>
-        <w:rPr>
-          <w:i/>
-          <w:iCs/>
-        </w:rPr>
-        <w:t xml:space="preserve"> </w:t>
-      </w:r>
-      <w:r>
-        <w:rPr>
-          <w:i/>
-          <w:iCs/>
-        </w:rPr>
-        <w:t xml:space="preserve">and grant/contract number here — required by the funder and by ESWA’s funding</w:t>
-      </w:r>
-      <w:r>
-        <w:rPr>
-          <w:i/>
-          <w:iCs/>
-        </w:rPr>
-        <w:t xml:space="preserve"> </w:t>
-      </w:r>
-      <w:r>
-        <w:rPr>
-          <w:i/>
-          <w:iCs/>
-        </w:rPr>
-        <w:t xml:space="preserve">acknowledgment policy; do not leave blank if funded work.)</w:t>
+        <w:t xml:space="preserve">[[of &lt;institution name, e.g., Universitas Negeri Malang — confirm exact English name for the affiliation line&gt;]]</w:t>
+      </w:r>
+      <w:r>
+        <w:t xml:space="preserve">, grant number 20.4.91/UN32.5.2/LT/2026.</w:t>
       </w:r>
     </w:p>
     <w:p>
@@ -14605,7 +14621,7 @@
         <w:t xml:space="preserve"> </w:t>
       </w:r>
       <w:r>
-        <w:t xml:space="preserve">for evaluation</w:t>
+        <w:t xml:space="preserve">for evaluation will be made available at</w:t>
       </w:r>
       <w:r>
         <w:t xml:space="preserve"> </w:t>
@@ -14614,10 +14630,19 @@
         <w:rPr>
           <w:rStyle w:val="VerbatimChar"/>
         </w:rPr>
-        <w:t xml:space="preserve">[[will be made available at &lt;repository URL, e.g., GitHub/Zenodo, to be inserted by the author&gt; upon acceptance / are available at &lt;URL&gt; ]]</w:t>
-      </w:r>
-      <w:r>
-        <w:t xml:space="preserve">.</w:t>
+        <w:t xml:space="preserve">[[repository URL, e.g., GitHub]]</w:t>
+      </w:r>
+      <w:r>
+        <w:t xml:space="preserve"> </w:t>
+      </w:r>
+      <w:r>
+        <w:t xml:space="preserve">upon</w:t>
+      </w:r>
+      <w:r>
+        <w:t xml:space="preserve"> </w:t>
+      </w:r>
+      <w:r>
+        <w:t xml:space="preserve">acceptance.</w:t>
       </w:r>
     </w:p>
     <w:p>

</xml_diff>